<commit_message>
Final Actividad 1  identificar el proyecto tecnologico
</commit_message>
<xml_diff>
--- a/Actividad 1 - Identificar el proyecto tecnológico a trabajar.docx
+++ b/Actividad 1 - Identificar el proyecto tecnológico a trabajar.docx
@@ -1,10 +1,10 @@
 
 <file path=word/document.xml><?xml version="1.0" encoding="utf-8"?>
-<w:document xmlns:wpc="http://schemas.microsoft.com/office/word/2010/wordprocessingCanvas" xmlns:cx="http://schemas.microsoft.com/office/drawing/2014/chartex" xmlns:cx1="http://schemas.microsoft.com/office/drawing/2015/9/8/chartex" xmlns:cx2="http://schemas.microsoft.com/office/drawing/2015/10/21/chartex" xmlns:cx3="http://schemas.microsoft.com/office/drawing/2016/5/9/chartex" xmlns:cx4="http://schemas.microsoft.com/office/drawing/2016/5/10/chartex" xmlns:cx5="http://schemas.microsoft.com/office/drawing/2016/5/11/chartex" xmlns:cx6="http://schemas.microsoft.com/office/drawing/2016/5/12/chartex" xmlns:cx7="http://schemas.microsoft.com/office/drawing/2016/5/13/chartex" xmlns:cx8="http://schemas.microsoft.com/office/drawing/2016/5/14/chartex" xmlns:mc="http://schemas.openxmlformats.org/markup-compatibility/2006" xmlns:aink="http://schemas.microsoft.com/office/drawing/2016/ink" xmlns:am3d="http://schemas.microsoft.com/office/drawing/2017/model3d" xmlns:o="urn:schemas-microsoft-com:office:office" xmlns:r="http://schemas.openxmlformats.org/officeDocument/2006/relationships" xmlns:m="http://schemas.openxmlformats.org/officeDocument/2006/math" xmlns:v="urn:schemas-microsoft-com:vml" xmlns:wp14="http://schemas.microsoft.com/office/word/2010/wordprocessingDrawing" xmlns:wp="http://schemas.openxmlformats.org/drawingml/2006/wordprocessingDrawing" xmlns:w10="urn:schemas-microsoft-com:office:word" xmlns:w="http://schemas.openxmlformats.org/wordprocessingml/2006/main" xmlns:w14="http://schemas.microsoft.com/office/word/2010/wordml" xmlns:w15="http://schemas.microsoft.com/office/word/2012/wordml" xmlns:w16cex="http://schemas.microsoft.com/office/word/2018/wordml/cex" xmlns:w16cid="http://schemas.microsoft.com/office/word/2016/wordml/cid" xmlns:w16="http://schemas.microsoft.com/office/word/2018/wordml" xmlns:w16sdtdh="http://schemas.microsoft.com/office/word/2020/wordml/sdtdatahash" xmlns:w16se="http://schemas.microsoft.com/office/word/2015/wordml/symex" xmlns:wpg="http://schemas.microsoft.com/office/word/2010/wordprocessingGroup" xmlns:wpi="http://schemas.microsoft.com/office/word/2010/wordprocessingInk" xmlns:wne="http://schemas.microsoft.com/office/word/2006/wordml" xmlns:wps="http://schemas.microsoft.com/office/word/2010/wordprocessingShape" mc:Ignorable="w14 w15 w16se w16cid w16 w16cex w16sdtdh wp14">
+<w:document xmlns:wpc="http://schemas.microsoft.com/office/word/2010/wordprocessingCanvas" xmlns:cx="http://schemas.microsoft.com/office/drawing/2014/chartex" xmlns:cx1="http://schemas.microsoft.com/office/drawing/2015/9/8/chartex" xmlns:cx2="http://schemas.microsoft.com/office/drawing/2015/10/21/chartex" xmlns:cx3="http://schemas.microsoft.com/office/drawing/2016/5/9/chartex" xmlns:cx4="http://schemas.microsoft.com/office/drawing/2016/5/10/chartex" xmlns:cx5="http://schemas.microsoft.com/office/drawing/2016/5/11/chartex" xmlns:cx6="http://schemas.microsoft.com/office/drawing/2016/5/12/chartex" xmlns:cx7="http://schemas.microsoft.com/office/drawing/2016/5/13/chartex" xmlns:cx8="http://schemas.microsoft.com/office/drawing/2016/5/14/chartex" xmlns:mc="http://schemas.openxmlformats.org/markup-compatibility/2006" xmlns:aink="http://schemas.microsoft.com/office/drawing/2016/ink" xmlns:am3d="http://schemas.microsoft.com/office/drawing/2017/model3d" xmlns:o="urn:schemas-microsoft-com:office:office" xmlns:oel="http://schemas.microsoft.com/office/2019/extlst" xmlns:r="http://schemas.openxmlformats.org/officeDocument/2006/relationships" xmlns:m="http://schemas.openxmlformats.org/officeDocument/2006/math" xmlns:v="urn:schemas-microsoft-com:vml" xmlns:wp14="http://schemas.microsoft.com/office/word/2010/wordprocessingDrawing" xmlns:wp="http://schemas.openxmlformats.org/drawingml/2006/wordprocessingDrawing" xmlns:w10="urn:schemas-microsoft-com:office:word" xmlns:w="http://schemas.openxmlformats.org/wordprocessingml/2006/main" xmlns:w14="http://schemas.microsoft.com/office/word/2010/wordml" xmlns:w15="http://schemas.microsoft.com/office/word/2012/wordml" xmlns:w16cex="http://schemas.microsoft.com/office/word/2018/wordml/cex" xmlns:w16cid="http://schemas.microsoft.com/office/word/2016/wordml/cid" xmlns:w16="http://schemas.microsoft.com/office/word/2018/wordml" xmlns:w16du="http://schemas.microsoft.com/office/word/2023/wordml/word16du" xmlns:w16sdtdh="http://schemas.microsoft.com/office/word/2020/wordml/sdtdatahash" xmlns:w16sdtfl="http://schemas.microsoft.com/office/word/2024/wordml/sdtformatlock" xmlns:w16se="http://schemas.microsoft.com/office/word/2015/wordml/symex" xmlns:wpg="http://schemas.microsoft.com/office/word/2010/wordprocessingGroup" xmlns:wpi="http://schemas.microsoft.com/office/word/2010/wordprocessingInk" xmlns:wne="http://schemas.microsoft.com/office/word/2006/wordml" xmlns:wps="http://schemas.microsoft.com/office/word/2010/wordprocessingShape" mc:Ignorable="w14 w15 w16se w16cid w16 w16cex w16sdtdh w16sdtfl w16du wp14">
   <w:body>
     <w:p>
       <w:pPr>
-        <w:jc w:val="center"/>
+        <w:pStyle w:val="Sinespaciado"/>
         <w:rPr>
           <w:rStyle w:val="Textoennegrita"/>
           <w:rFonts w:ascii="Arial" w:hAnsi="Arial" w:cs="Arial"/>
@@ -15,36 +15,28 @@
       <w:bookmarkStart w:id="0" w:name="_Hlk209864032"/>
       <w:r>
         <w:rPr>
-          <w:rFonts w:ascii="Arial" w:eastAsia="Times New Roman" w:hAnsi="Arial" w:cs="Arial"/>
-          <w:kern w:val="36"/>
           <w:lang w:eastAsia="es-CO"/>
         </w:rPr>
         <w:t>Actividad 1 - Identificar el proyecto tecnol</w:t>
       </w:r>
       <w:r>
         <w:rPr>
-          <w:rFonts w:ascii="Arial" w:eastAsia="Times New Roman" w:hAnsi="Arial" w:cs="Arial" w:hint="cs"/>
-          <w:kern w:val="36"/>
+          <w:rFonts w:hint="cs"/>
           <w:lang w:eastAsia="es-CO"/>
         </w:rPr>
         <w:t>ó</w:t>
       </w:r>
       <w:r>
         <w:rPr>
-          <w:rFonts w:ascii="Arial" w:eastAsia="Times New Roman" w:hAnsi="Arial" w:cs="Arial"/>
-          <w:kern w:val="36"/>
           <w:lang w:eastAsia="es-CO"/>
         </w:rPr>
-        <w:t xml:space="preserve">gico a </w:t>
-      </w:r>
-      <w:proofErr w:type="spellStart"/>
-      <w:r>
-        <w:rPr>
-          <w:rFonts w:ascii="Arial" w:eastAsia="Times New Roman" w:hAnsi="Arial" w:cs="Arial"/>
-          <w:kern w:val="36"/>
+        <w:t>gico a trabajar</w:t>
+      </w:r>
+      <w:r>
+        <w:rPr>
           <w:lang w:eastAsia="es-CO"/>
         </w:rPr>
-        <w:t>trabajar</w:t>
+        <w:t xml:space="preserve"> </w:t>
       </w:r>
       <w:r>
         <w:rPr>
@@ -53,9 +45,18 @@
           <w:b w:val="0"/>
           <w:bCs w:val="0"/>
         </w:rPr>
-        <w:t>Sistema</w:t>
-      </w:r>
-      <w:proofErr w:type="spellEnd"/>
+        <w:t xml:space="preserve">Sistema de Recolección </w:t>
+      </w:r>
+    </w:p>
+    <w:p>
+      <w:pPr>
+        <w:jc w:val="center"/>
+        <w:rPr>
+          <w:rFonts w:ascii="Arial" w:hAnsi="Arial" w:cs="Arial"/>
+          <w:b/>
+          <w:bCs/>
+        </w:rPr>
+      </w:pPr>
       <w:r>
         <w:rPr>
           <w:rStyle w:val="Textoennegrita"/>
@@ -63,33 +64,14 @@
           <w:b w:val="0"/>
           <w:bCs w:val="0"/>
         </w:rPr>
-        <w:t xml:space="preserve"> de Recolección </w:t>
-      </w:r>
-    </w:p>
-    <w:p>
-      <w:pPr>
-        <w:jc w:val="center"/>
+        <w:t>de Datos de Producción Textil en Tiempo Real</w:t>
+      </w:r>
+      <w:r>
         <w:rPr>
           <w:rFonts w:ascii="Arial" w:hAnsi="Arial" w:cs="Arial"/>
           <w:b/>
           <w:bCs/>
         </w:rPr>
-      </w:pPr>
-      <w:r>
-        <w:rPr>
-          <w:rStyle w:val="Textoennegrita"/>
-          <w:rFonts w:ascii="Arial" w:hAnsi="Arial" w:cs="Arial"/>
-          <w:b w:val="0"/>
-          <w:bCs w:val="0"/>
-        </w:rPr>
-        <w:t>de Datos de Producción Textil en Tiempo Real</w:t>
-      </w:r>
-      <w:r>
-        <w:rPr>
-          <w:rFonts w:ascii="Arial" w:hAnsi="Arial" w:cs="Arial"/>
-          <w:b/>
-          <w:bCs/>
-        </w:rPr>
         <w:t>.</w:t>
       </w:r>
     </w:p>
@@ -170,6 +152,12 @@
           <w:color w:val="auto"/>
         </w:rPr>
       </w:pPr>
+      <w:r>
+        <w:rPr>
+          <w:color w:val="auto"/>
+        </w:rPr>
+        <w:t>Saulo Andres Franco Torres</w:t>
+      </w:r>
     </w:p>
     <w:p>
       <w:pPr>
@@ -477,6 +465,21 @@
           <w:color w:val="auto"/>
         </w:rPr>
         <w:t>INGENIERIA DE SOFTWARE</w:t>
+      </w:r>
+    </w:p>
+    <w:p>
+      <w:pPr>
+        <w:pStyle w:val="Default"/>
+        <w:jc w:val="center"/>
+        <w:rPr>
+          <w:color w:val="auto"/>
+        </w:rPr>
+      </w:pPr>
+      <w:r>
+        <w:rPr>
+          <w:color w:val="auto"/>
+        </w:rPr>
+        <w:t>2025</w:t>
       </w:r>
     </w:p>
     <w:p>
@@ -490,12 +493,6 @@
           <w:lang w:eastAsia="es-CO"/>
         </w:rPr>
       </w:pPr>
-      <w:r>
-        <w:rPr>
-          <w:color w:val="auto"/>
-        </w:rPr>
-        <w:t>2025</w:t>
-      </w:r>
     </w:p>
     <w:sdt>
       <w:sdtPr>
@@ -514,7 +511,6 @@
           <w:docPartUnique/>
         </w:docPartObj>
       </w:sdtPr>
-      <w:sdtEndPr/>
       <w:sdtContent>
         <w:p>
           <w:pPr>
@@ -3072,7 +3068,27 @@
                 <w:sz w:val="24"/>
                 <w:szCs w:val="24"/>
               </w:rPr>
-              <w:t>Metodología Kanban e Historias de Usuario</w:t>
+              <w:t>Metodología Kanba</w:t>
+            </w:r>
+            <w:r>
+              <w:rPr>
+                <w:rStyle w:val="Hipervnculo"/>
+                <w:rFonts w:ascii="Arial" w:hAnsi="Arial" w:cs="Arial"/>
+                <w:noProof/>
+                <w:sz w:val="24"/>
+                <w:szCs w:val="24"/>
+              </w:rPr>
+              <w:t>n</w:t>
+            </w:r>
+            <w:r>
+              <w:rPr>
+                <w:rStyle w:val="Hipervnculo"/>
+                <w:rFonts w:ascii="Arial" w:hAnsi="Arial" w:cs="Arial"/>
+                <w:noProof/>
+                <w:sz w:val="24"/>
+                <w:szCs w:val="24"/>
+              </w:rPr>
+              <w:t xml:space="preserve"> e Historias de Usuario</w:t>
             </w:r>
             <w:r>
               <w:rPr>
@@ -3549,7 +3565,27 @@
                 <w:sz w:val="24"/>
                 <w:szCs w:val="24"/>
               </w:rPr>
-              <w:t>Diagrama de Flujo</w:t>
+              <w:t>Diagrama d</w:t>
+            </w:r>
+            <w:r>
+              <w:rPr>
+                <w:rStyle w:val="Hipervnculo"/>
+                <w:rFonts w:ascii="Arial" w:hAnsi="Arial" w:cs="Arial"/>
+                <w:noProof/>
+                <w:sz w:val="24"/>
+                <w:szCs w:val="24"/>
+              </w:rPr>
+              <w:t>e</w:t>
+            </w:r>
+            <w:r>
+              <w:rPr>
+                <w:rStyle w:val="Hipervnculo"/>
+                <w:rFonts w:ascii="Arial" w:hAnsi="Arial" w:cs="Arial"/>
+                <w:noProof/>
+                <w:sz w:val="24"/>
+                <w:szCs w:val="24"/>
+              </w:rPr>
+              <w:t xml:space="preserve"> Flujo</w:t>
             </w:r>
             <w:r>
               <w:rPr>
@@ -3644,7 +3680,47 @@
                 <w:sz w:val="24"/>
                 <w:szCs w:val="24"/>
               </w:rPr>
-              <w:t>Cronograma de costos</w:t>
+              <w:t>Cronograma de</w:t>
+            </w:r>
+            <w:r>
+              <w:rPr>
+                <w:rStyle w:val="Hipervnculo"/>
+                <w:rFonts w:ascii="Arial" w:hAnsi="Arial" w:cs="Arial"/>
+                <w:noProof/>
+                <w:sz w:val="24"/>
+                <w:szCs w:val="24"/>
+              </w:rPr>
+              <w:t xml:space="preserve"> </w:t>
+            </w:r>
+            <w:r>
+              <w:rPr>
+                <w:rStyle w:val="Hipervnculo"/>
+                <w:rFonts w:ascii="Arial" w:hAnsi="Arial" w:cs="Arial"/>
+                <w:noProof/>
+                <w:sz w:val="24"/>
+                <w:szCs w:val="24"/>
+              </w:rPr>
+              <w:t>co</w:t>
+            </w:r>
+            <w:r>
+              <w:rPr>
+                <w:rStyle w:val="Hipervnculo"/>
+                <w:rFonts w:ascii="Arial" w:hAnsi="Arial" w:cs="Arial"/>
+                <w:noProof/>
+                <w:sz w:val="24"/>
+                <w:szCs w:val="24"/>
+              </w:rPr>
+              <w:t>s</w:t>
+            </w:r>
+            <w:r>
+              <w:rPr>
+                <w:rStyle w:val="Hipervnculo"/>
+                <w:rFonts w:ascii="Arial" w:hAnsi="Arial" w:cs="Arial"/>
+                <w:noProof/>
+                <w:sz w:val="24"/>
+                <w:szCs w:val="24"/>
+              </w:rPr>
+              <w:t>tos</w:t>
             </w:r>
             <w:r>
               <w:rPr>
@@ -7950,7 +8026,6 @@
     <w:p>
       <w:pPr>
         <w:pStyle w:val="NormalWeb"/>
-        <w:jc w:val="both"/>
         <w:rPr>
           <w:rFonts w:ascii="Arial" w:hAnsi="Arial" w:cs="Arial"/>
         </w:rPr>
@@ -7959,32 +8034,6 @@
     <w:p>
       <w:pPr>
         <w:pStyle w:val="NormalWeb"/>
-        <w:jc w:val="both"/>
-        <w:rPr>
-          <w:rFonts w:ascii="Arial" w:hAnsi="Arial" w:cs="Arial"/>
-        </w:rPr>
-      </w:pPr>
-    </w:p>
-    <w:p>
-      <w:pPr>
-        <w:pStyle w:val="NormalWeb"/>
-        <w:jc w:val="both"/>
-        <w:rPr>
-          <w:rFonts w:ascii="Arial" w:hAnsi="Arial" w:cs="Arial"/>
-        </w:rPr>
-      </w:pPr>
-    </w:p>
-    <w:p>
-      <w:pPr>
-        <w:pStyle w:val="NormalWeb"/>
-        <w:rPr>
-          <w:rFonts w:ascii="Arial" w:hAnsi="Arial" w:cs="Arial"/>
-        </w:rPr>
-      </w:pPr>
-    </w:p>
-    <w:p>
-      <w:pPr>
-        <w:pStyle w:val="NormalWeb"/>
         <w:rPr>
           <w:rFonts w:ascii="Arial" w:hAnsi="Arial" w:cs="Arial"/>
         </w:rPr>
@@ -7994,11 +8043,10 @@
           <w:rFonts w:ascii="Arial" w:hAnsi="Arial" w:cs="Arial"/>
           <w:noProof/>
         </w:rPr>
-        <w:lastRenderedPageBreak/>
         <w:drawing>
-          <wp:inline distT="0" distB="0" distL="0" distR="0" wp14:anchorId="3131C915" wp14:editId="5DFBED2A">
-            <wp:extent cx="5612130" cy="2729865"/>
-            <wp:effectExtent l="0" t="0" r="7620" b="0"/>
+          <wp:inline distT="0" distB="0" distL="0" distR="0" wp14:anchorId="3131C915" wp14:editId="55ACA760">
+            <wp:extent cx="5456442" cy="2654135"/>
+            <wp:effectExtent l="0" t="0" r="0" b="0"/>
             <wp:docPr id="3" name="Imagen 3"/>
             <wp:cNvGraphicFramePr>
               <a:graphicFrameLocks xmlns:a="http://schemas.openxmlformats.org/drawingml/2006/main" noChangeAspect="1"/>
@@ -8019,7 +8067,7 @@
                   <pic:spPr>
                     <a:xfrm>
                       <a:off x="0" y="0"/>
-                      <a:ext cx="5612130" cy="2729865"/>
+                      <a:ext cx="5462331" cy="2657000"/>
                     </a:xfrm>
                     <a:prstGeom prst="rect">
                       <a:avLst/>
@@ -8035,141 +8083,6 @@
     <w:p>
       <w:pPr>
         <w:pStyle w:val="NormalWeb"/>
-        <w:rPr>
-          <w:rFonts w:ascii="Arial" w:hAnsi="Arial" w:cs="Arial"/>
-        </w:rPr>
-      </w:pPr>
-    </w:p>
-    <w:p>
-      <w:pPr>
-        <w:ind w:left="720"/>
-        <w:jc w:val="both"/>
-        <w:rPr>
-          <w:rFonts w:ascii="Arial" w:hAnsi="Arial" w:cs="Arial"/>
-          <w:lang w:val="es-ES"/>
-        </w:rPr>
-      </w:pPr>
-    </w:p>
-    <w:p>
-      <w:pPr>
-        <w:pStyle w:val="NormalWeb"/>
-        <w:jc w:val="both"/>
-        <w:rPr>
-          <w:rFonts w:ascii="Arial" w:hAnsi="Arial" w:cs="Arial"/>
-        </w:rPr>
-      </w:pPr>
-    </w:p>
-    <w:p>
-      <w:pPr>
-        <w:pStyle w:val="NormalWeb"/>
-        <w:jc w:val="both"/>
-        <w:rPr>
-          <w:rFonts w:ascii="Arial" w:hAnsi="Arial" w:cs="Arial"/>
-        </w:rPr>
-      </w:pPr>
-    </w:p>
-    <w:p>
-      <w:pPr>
-        <w:pStyle w:val="NormalWeb"/>
-        <w:jc w:val="both"/>
-        <w:rPr>
-          <w:rFonts w:ascii="Arial" w:hAnsi="Arial" w:cs="Arial"/>
-        </w:rPr>
-      </w:pPr>
-    </w:p>
-    <w:p>
-      <w:pPr>
-        <w:pStyle w:val="NormalWeb"/>
-        <w:jc w:val="both"/>
-        <w:rPr>
-          <w:rFonts w:ascii="Arial" w:hAnsi="Arial" w:cs="Arial"/>
-        </w:rPr>
-      </w:pPr>
-    </w:p>
-    <w:p>
-      <w:pPr>
-        <w:pStyle w:val="NormalWeb"/>
-        <w:jc w:val="both"/>
-        <w:rPr>
-          <w:rFonts w:ascii="Arial" w:hAnsi="Arial" w:cs="Arial"/>
-        </w:rPr>
-      </w:pPr>
-    </w:p>
-    <w:p>
-      <w:pPr>
-        <w:pStyle w:val="NormalWeb"/>
-        <w:jc w:val="both"/>
-        <w:rPr>
-          <w:rFonts w:ascii="Arial" w:hAnsi="Arial" w:cs="Arial"/>
-        </w:rPr>
-      </w:pPr>
-    </w:p>
-    <w:p>
-      <w:pPr>
-        <w:pStyle w:val="NormalWeb"/>
-        <w:jc w:val="both"/>
-        <w:rPr>
-          <w:rFonts w:ascii="Arial" w:hAnsi="Arial" w:cs="Arial"/>
-        </w:rPr>
-      </w:pPr>
-    </w:p>
-    <w:p>
-      <w:pPr>
-        <w:pStyle w:val="NormalWeb"/>
-        <w:jc w:val="both"/>
-        <w:rPr>
-          <w:rFonts w:ascii="Arial" w:hAnsi="Arial" w:cs="Arial"/>
-        </w:rPr>
-      </w:pPr>
-    </w:p>
-    <w:p>
-      <w:pPr>
-        <w:pStyle w:val="NormalWeb"/>
-        <w:jc w:val="both"/>
-        <w:rPr>
-          <w:rFonts w:ascii="Arial" w:hAnsi="Arial" w:cs="Arial"/>
-        </w:rPr>
-      </w:pPr>
-    </w:p>
-    <w:p>
-      <w:pPr>
-        <w:pStyle w:val="NormalWeb"/>
-        <w:jc w:val="both"/>
-        <w:rPr>
-          <w:rFonts w:ascii="Arial" w:hAnsi="Arial" w:cs="Arial"/>
-        </w:rPr>
-      </w:pPr>
-    </w:p>
-    <w:p>
-      <w:pPr>
-        <w:pStyle w:val="NormalWeb"/>
-        <w:jc w:val="both"/>
-        <w:rPr>
-          <w:rFonts w:ascii="Arial" w:hAnsi="Arial" w:cs="Arial"/>
-        </w:rPr>
-      </w:pPr>
-    </w:p>
-    <w:p>
-      <w:pPr>
-        <w:pStyle w:val="NormalWeb"/>
-        <w:jc w:val="both"/>
-        <w:rPr>
-          <w:rFonts w:ascii="Arial" w:hAnsi="Arial" w:cs="Arial"/>
-        </w:rPr>
-      </w:pPr>
-    </w:p>
-    <w:p>
-      <w:pPr>
-        <w:pStyle w:val="NormalWeb"/>
-        <w:jc w:val="both"/>
-        <w:rPr>
-          <w:rFonts w:ascii="Arial" w:hAnsi="Arial" w:cs="Arial"/>
-        </w:rPr>
-      </w:pPr>
-    </w:p>
-    <w:p>
-      <w:pPr>
-        <w:pStyle w:val="NormalWeb"/>
         <w:jc w:val="both"/>
         <w:rPr>
           <w:rFonts w:ascii="Arial" w:hAnsi="Arial" w:cs="Arial"/>
@@ -8857,15 +8770,6 @@
     <w:p>
       <w:pPr>
         <w:pStyle w:val="NormalWeb"/>
-        <w:jc w:val="both"/>
-        <w:rPr>
-          <w:rFonts w:ascii="Arial" w:hAnsi="Arial" w:cs="Arial"/>
-        </w:rPr>
-      </w:pPr>
-    </w:p>
-    <w:p>
-      <w:pPr>
-        <w:pStyle w:val="NormalWeb"/>
         <w:keepNext/>
         <w:jc w:val="both"/>
         <w:rPr>
@@ -8877,6 +8781,7 @@
           <w:rFonts w:ascii="Arial" w:hAnsi="Arial" w:cs="Arial"/>
           <w:noProof/>
         </w:rPr>
+        <w:lastRenderedPageBreak/>
         <w:drawing>
           <wp:inline distT="0" distB="0" distL="0" distR="0" wp14:anchorId="243B9D78" wp14:editId="5B1AB5D9">
             <wp:extent cx="5612130" cy="2643505"/>
@@ -9181,6 +9086,17 @@
         </w:rPr>
         <w:t>Alinear al equipo en el "qué" resolver</w:t>
       </w:r>
+    </w:p>
+    <w:p>
+      <w:pPr>
+        <w:pStyle w:val="ds-markdown-paragraph"/>
+        <w:shd w:val="clear" w:color="auto" w:fill="FFFFFF"/>
+        <w:spacing w:after="0" w:afterAutospacing="0"/>
+        <w:rPr>
+          <w:rFonts w:ascii="Arial" w:hAnsi="Arial" w:cs="Arial"/>
+          <w:color w:val="0F1115"/>
+        </w:rPr>
+      </w:pPr>
     </w:p>
     <w:p>
       <w:pPr>
@@ -9484,14 +9400,27 @@
       <w:r>
         <w:t xml:space="preserve">n </w:t>
       </w:r>
-      <w:fldSimple w:instr=" SEQ Ilustración \* ARABIC ">
-        <w:r>
-          <w:rPr>
-            <w:noProof/>
-          </w:rPr>
-          <w:t>2</w:t>
-        </w:r>
-      </w:fldSimple>
+      <w:r>
+        <w:fldChar w:fldCharType="begin"/>
+      </w:r>
+      <w:r>
+        <w:instrText xml:space="preserve"> SEQ Ilustración \* ARABIC </w:instrText>
+      </w:r>
+      <w:r>
+        <w:fldChar w:fldCharType="separate"/>
+      </w:r>
+      <w:r>
+        <w:rPr>
+          <w:noProof/>
+        </w:rPr>
+        <w:t>2</w:t>
+      </w:r>
+      <w:r>
+        <w:rPr>
+          <w:noProof/>
+        </w:rPr>
+        <w:fldChar w:fldCharType="end"/>
+      </w:r>
       <w:r>
         <w:t xml:space="preserve"> </w:t>
       </w:r>
@@ -9881,7 +9810,7 @@
           <w:szCs w:val="24"/>
           <w:lang w:val="en-US"/>
         </w:rPr>
-        <w:t>BRAINSTORMING]  [</w:t>
+        <w:t xml:space="preserve">BRAINSTORMING]  [SCAMPER]   </w:t>
       </w:r>
       <w:proofErr w:type="gramEnd"/>
       <w:r>
@@ -9892,7 +9821,7 @@
           <w:szCs w:val="24"/>
           <w:lang w:val="en-US"/>
         </w:rPr>
-        <w:t>SCAMPER]    [HOW MIGHT WE]</w:t>
+        <w:t xml:space="preserve"> [HOW MIGHT WE]</w:t>
       </w:r>
     </w:p>
     <w:p>
@@ -10207,6 +10136,17 @@
     </w:p>
     <w:p>
       <w:pPr>
+        <w:pStyle w:val="ds-markdown-paragraph"/>
+        <w:shd w:val="clear" w:color="auto" w:fill="FFFFFF"/>
+        <w:spacing w:after="0" w:afterAutospacing="0"/>
+        <w:rPr>
+          <w:rFonts w:ascii="Arial" w:hAnsi="Arial" w:cs="Arial"/>
+          <w:color w:val="0F1115"/>
+        </w:rPr>
+      </w:pPr>
+    </w:p>
+    <w:p>
+      <w:pPr>
         <w:pStyle w:val="Ttulo3"/>
         <w:shd w:val="clear" w:color="auto" w:fill="FFFFFF"/>
         <w:spacing w:before="480" w:after="240" w:line="450" w:lineRule="atLeast"/>
@@ -10227,6 +10167,7 @@
           <w:sz w:val="24"/>
           <w:szCs w:val="24"/>
         </w:rPr>
+        <w:lastRenderedPageBreak/>
         <w:t>Proceso de Ideación</w:t>
       </w:r>
     </w:p>
@@ -10280,7 +10221,6 @@
           <w:rFonts w:ascii="Arial" w:eastAsiaTheme="majorEastAsia" w:hAnsi="Arial" w:cs="Arial"/>
           <w:color w:val="0F1115"/>
         </w:rPr>
-        <w:lastRenderedPageBreak/>
         <w:t>Generación:</w:t>
       </w:r>
       <w:r>
@@ -10588,40 +10528,33 @@
       <w:r>
         <w:t xml:space="preserve">n </w:t>
       </w:r>
-      <w:fldSimple w:instr=" SEQ Ilustración \* ARABIC ">
-        <w:r>
-          <w:rPr>
-            <w:noProof/>
-          </w:rPr>
-          <w:t>3</w:t>
-        </w:r>
-      </w:fldSimple>
+      <w:r>
+        <w:fldChar w:fldCharType="begin"/>
+      </w:r>
+      <w:r>
+        <w:instrText xml:space="preserve"> SEQ Ilustración \* ARABIC </w:instrText>
+      </w:r>
+      <w:r>
+        <w:fldChar w:fldCharType="separate"/>
+      </w:r>
+      <w:r>
+        <w:rPr>
+          <w:noProof/>
+        </w:rPr>
+        <w:t>3</w:t>
+      </w:r>
+      <w:r>
+        <w:rPr>
+          <w:noProof/>
+        </w:rPr>
+        <w:fldChar w:fldCharType="end"/>
+      </w:r>
       <w:r>
         <w:t xml:space="preserve"> </w:t>
       </w:r>
       <w:r>
         <w:t>https://miro.com/welcomeonboard/dU1PSks5VitHcWMrNWhBMHd1KzJXOEdxMUhwV3A0UkZHWmxYRFFyWmdMTGk0TUdFTFpmcnVoSmZUSjdhd2NHMWZaNjd1bXA2NllvQWN1NXVDL3VIelBZaWw4NS9SQ1laeTdBQ0crQXNBeTIxd2ZMSjF4elBNcGd4TVI4Z3hkb3NzVXVvMm53MW9OWFg5bkJoVXZxdFhRPT0hdjE=?share_link_i</w:t>
       </w:r>
-    </w:p>
-    <w:p>
-      <w:pPr>
-        <w:ind w:left="720"/>
-        <w:jc w:val="both"/>
-        <w:rPr>
-          <w:rFonts w:ascii="Arial" w:hAnsi="Arial" w:cs="Arial"/>
-          <w:lang w:val="es-ES"/>
-        </w:rPr>
-      </w:pPr>
-    </w:p>
-    <w:p>
-      <w:pPr>
-        <w:ind w:left="720"/>
-        <w:jc w:val="both"/>
-        <w:rPr>
-          <w:rFonts w:ascii="Arial" w:hAnsi="Arial" w:cs="Arial"/>
-          <w:lang w:val="es-ES"/>
-        </w:rPr>
-      </w:pPr>
     </w:p>
     <w:p>
       <w:pPr>
@@ -12585,7 +12518,6 @@
               <w:bottom w:val="single" w:sz="4" w:space="0" w:color="auto"/>
               <w:right w:val="single" w:sz="4" w:space="0" w:color="auto"/>
             </w:tcBorders>
-            <w:shd w:val="clear" w:color="auto" w:fill="auto"/>
             <w:noWrap/>
             <w:vAlign w:val="center"/>
             <w:hideMark/>
@@ -12625,7 +12557,6 @@
               <w:bottom w:val="single" w:sz="4" w:space="0" w:color="auto"/>
               <w:right w:val="single" w:sz="4" w:space="0" w:color="auto"/>
             </w:tcBorders>
-            <w:shd w:val="clear" w:color="auto" w:fill="auto"/>
             <w:noWrap/>
             <w:vAlign w:val="center"/>
             <w:hideMark/>
@@ -12665,7 +12596,6 @@
               <w:bottom w:val="single" w:sz="4" w:space="0" w:color="auto"/>
               <w:right w:val="single" w:sz="4" w:space="0" w:color="auto"/>
             </w:tcBorders>
-            <w:shd w:val="clear" w:color="auto" w:fill="auto"/>
             <w:noWrap/>
             <w:vAlign w:val="center"/>
             <w:hideMark/>
@@ -12705,7 +12635,6 @@
               <w:bottom w:val="single" w:sz="4" w:space="0" w:color="auto"/>
               <w:right w:val="single" w:sz="4" w:space="0" w:color="auto"/>
             </w:tcBorders>
-            <w:shd w:val="clear" w:color="auto" w:fill="auto"/>
             <w:noWrap/>
             <w:vAlign w:val="center"/>
             <w:hideMark/>
@@ -13878,6 +13807,7 @@
           <w:rFonts w:ascii="Arial" w:hAnsi="Arial" w:cs="Arial"/>
           <w:b/>
           <w:bCs/>
+          <w:noProof/>
           <w:color w:val="auto"/>
           <w:sz w:val="32"/>
           <w:szCs w:val="32"/>
@@ -13978,34 +13908,6 @@
     </w:p>
     <w:p>
       <w:pPr>
-        <w:rPr>
-          <w:lang w:val="es-ES"/>
-        </w:rPr>
-      </w:pPr>
-    </w:p>
-    <w:p>
-      <w:pPr>
-        <w:rPr>
-          <w:lang w:val="es-ES"/>
-        </w:rPr>
-      </w:pPr>
-    </w:p>
-    <w:p>
-      <w:pPr>
-        <w:rPr>
-          <w:lang w:val="es-ES"/>
-        </w:rPr>
-      </w:pPr>
-    </w:p>
-    <w:p>
-      <w:pPr>
-        <w:rPr>
-          <w:lang w:val="es-ES"/>
-        </w:rPr>
-      </w:pPr>
-    </w:p>
-    <w:p>
-      <w:pPr>
         <w:pStyle w:val="Ttulo1"/>
         <w:rPr>
           <w:rFonts w:ascii="Arial" w:hAnsi="Arial" w:cs="Arial"/>
@@ -14017,31 +13919,7 @@
           <w:lang w:val="es-ES"/>
         </w:rPr>
       </w:pPr>
-    </w:p>
-    <w:p>
-      <w:pPr>
-        <w:rPr>
-          <w:lang w:val="es-ES"/>
-        </w:rPr>
-      </w:pPr>
-    </w:p>
-    <w:p>
-      <w:pPr>
-        <w:rPr>
-          <w:lang w:val="es-ES"/>
-        </w:rPr>
-      </w:pPr>
-    </w:p>
-    <w:p>
-      <w:pPr>
-        <w:rPr>
-          <w:lang w:val="es-ES"/>
-        </w:rPr>
-      </w:pPr>
-    </w:p>
-    <w:p>
-      <w:pPr>
-        <w:pStyle w:val="Ttulo1"/>
+      <w:r>
         <w:rPr>
           <w:rFonts w:ascii="Arial" w:hAnsi="Arial" w:cs="Arial"/>
           <w:b/>
@@ -14051,17 +13929,7 @@
           <w:szCs w:val="32"/>
           <w:lang w:val="es-ES"/>
         </w:rPr>
-      </w:pPr>
-      <w:r>
-        <w:rPr>
-          <w:rFonts w:ascii="Arial" w:hAnsi="Arial" w:cs="Arial"/>
-          <w:b/>
-          <w:bCs/>
-          <w:color w:val="auto"/>
-          <w:sz w:val="32"/>
-          <w:szCs w:val="32"/>
-          <w:lang w:val="es-ES"/>
-        </w:rPr>
+        <w:lastRenderedPageBreak/>
         <w:t>REQUISITOS</w:t>
       </w:r>
       <w:bookmarkEnd w:id="28"/>
@@ -14342,7 +14210,6 @@
           <w:rFonts w:ascii="Arial" w:hAnsi="Arial" w:cs="Arial"/>
           <w:noProof/>
         </w:rPr>
-        <w:lastRenderedPageBreak/>
         <w:drawing>
           <wp:inline distT="0" distB="0" distL="0" distR="0" wp14:anchorId="3C9C9594" wp14:editId="5E231319">
             <wp:extent cx="5612130" cy="1253490"/>
@@ -14955,19 +14822,25 @@
           <w:rFonts w:ascii="Arial" w:hAnsi="Arial" w:cs="Arial"/>
         </w:rPr>
       </w:pPr>
-    </w:p>
-    <w:p>
-      <w:pPr>
-        <w:pStyle w:val="NormalWeb"/>
-        <w:rPr>
-          <w:rFonts w:ascii="Arial" w:hAnsi="Arial" w:cs="Arial"/>
-        </w:rPr>
-      </w:pPr>
-      <w:r>
-        <w:rPr>
-          <w:rFonts w:ascii="Arial" w:hAnsi="Arial" w:cs="Arial"/>
-        </w:rPr>
-        <w:t>Comparto link del tablero Kanban en Trello con el contenido completo de las Historias de usuario</w:t>
+      <w:r>
+        <w:rPr>
+          <w:rFonts w:ascii="Arial" w:hAnsi="Arial" w:cs="Arial"/>
+        </w:rPr>
+        <w:t xml:space="preserve">Comparto </w:t>
+      </w:r>
+      <w:proofErr w:type="gramStart"/>
+      <w:r>
+        <w:rPr>
+          <w:rFonts w:ascii="Arial" w:hAnsi="Arial" w:cs="Arial"/>
+        </w:rPr>
+        <w:t>link</w:t>
+      </w:r>
+      <w:proofErr w:type="gramEnd"/>
+      <w:r>
+        <w:rPr>
+          <w:rFonts w:ascii="Arial" w:hAnsi="Arial" w:cs="Arial"/>
+        </w:rPr>
+        <w:t xml:space="preserve"> del tablero Kanban en Trello con el contenido completo de las Historias de usuario</w:t>
       </w:r>
     </w:p>
     <w:p>
@@ -14994,31 +14867,234 @@
           <w:lang w:val="es-ES"/>
         </w:rPr>
       </w:pPr>
-    </w:p>
-    <w:p>
-      <w:pPr>
-        <w:rPr>
-          <w:lang w:val="es-ES"/>
-        </w:rPr>
-      </w:pPr>
-    </w:p>
-    <w:p>
-      <w:pPr>
-        <w:rPr>
-          <w:lang w:val="es-ES"/>
-        </w:rPr>
-      </w:pPr>
-    </w:p>
-    <w:p>
-      <w:pPr>
-        <w:rPr>
-          <w:lang w:val="es-ES"/>
-        </w:rPr>
-      </w:pPr>
-    </w:p>
-    <w:p>
-      <w:pPr>
-        <w:rPr>
+      <w:r>
+        <w:drawing>
+          <wp:inline distT="0" distB="0" distL="0" distR="0" wp14:anchorId="2429818D" wp14:editId="5DB2ABB9">
+            <wp:extent cx="5612130" cy="2618740"/>
+            <wp:effectExtent l="0" t="0" r="7620" b="0"/>
+            <wp:docPr id="24977568" name="Imagen 21"/>
+            <wp:cNvGraphicFramePr>
+              <a:graphicFrameLocks xmlns:a="http://schemas.openxmlformats.org/drawingml/2006/main" noChangeAspect="1"/>
+            </wp:cNvGraphicFramePr>
+            <a:graphic xmlns:a="http://schemas.openxmlformats.org/drawingml/2006/main">
+              <a:graphicData uri="http://schemas.openxmlformats.org/drawingml/2006/picture">
+                <pic:pic xmlns:pic="http://schemas.openxmlformats.org/drawingml/2006/picture">
+                  <pic:nvPicPr>
+                    <pic:cNvPr id="0" name="Picture 29"/>
+                    <pic:cNvPicPr>
+                      <a:picLocks noChangeAspect="1" noChangeArrowheads="1"/>
+                    </pic:cNvPicPr>
+                  </pic:nvPicPr>
+                  <pic:blipFill>
+                    <a:blip r:embed="rId23">
+                      <a:extLst>
+                        <a:ext uri="{28A0092B-C50C-407E-A947-70E740481C1C}">
+                          <a14:useLocalDpi xmlns:a14="http://schemas.microsoft.com/office/drawing/2010/main" val="0"/>
+                        </a:ext>
+                      </a:extLst>
+                    </a:blip>
+                    <a:srcRect/>
+                    <a:stretch>
+                      <a:fillRect/>
+                    </a:stretch>
+                  </pic:blipFill>
+                  <pic:spPr bwMode="auto">
+                    <a:xfrm>
+                      <a:off x="0" y="0"/>
+                      <a:ext cx="5612130" cy="2618740"/>
+                    </a:xfrm>
+                    <a:prstGeom prst="rect">
+                      <a:avLst/>
+                    </a:prstGeom>
+                    <a:noFill/>
+                    <a:ln>
+                      <a:noFill/>
+                    </a:ln>
+                  </pic:spPr>
+                </pic:pic>
+              </a:graphicData>
+            </a:graphic>
+          </wp:inline>
+        </w:drawing>
+      </w:r>
+    </w:p>
+    <w:p>
+      <w:r>
+        <w:lastRenderedPageBreak/>
+        <w:drawing>
+          <wp:inline distT="0" distB="0" distL="0" distR="0" wp14:anchorId="45D1EE17" wp14:editId="1EC58046">
+            <wp:extent cx="5612130" cy="8233410"/>
+            <wp:effectExtent l="0" t="0" r="7620" b="0"/>
+            <wp:docPr id="725251772" name="Imagen 23"/>
+            <wp:cNvGraphicFramePr>
+              <a:graphicFrameLocks xmlns:a="http://schemas.openxmlformats.org/drawingml/2006/main" noChangeAspect="1"/>
+            </wp:cNvGraphicFramePr>
+            <a:graphic xmlns:a="http://schemas.openxmlformats.org/drawingml/2006/main">
+              <a:graphicData uri="http://schemas.openxmlformats.org/drawingml/2006/picture">
+                <pic:pic xmlns:pic="http://schemas.openxmlformats.org/drawingml/2006/picture">
+                  <pic:nvPicPr>
+                    <pic:cNvPr id="0" name="Picture 31"/>
+                    <pic:cNvPicPr>
+                      <a:picLocks noChangeAspect="1" noChangeArrowheads="1"/>
+                    </pic:cNvPicPr>
+                  </pic:nvPicPr>
+                  <pic:blipFill>
+                    <a:blip r:embed="rId24">
+                      <a:extLst>
+                        <a:ext uri="{28A0092B-C50C-407E-A947-70E740481C1C}">
+                          <a14:useLocalDpi xmlns:a14="http://schemas.microsoft.com/office/drawing/2010/main" val="0"/>
+                        </a:ext>
+                      </a:extLst>
+                    </a:blip>
+                    <a:srcRect/>
+                    <a:stretch>
+                      <a:fillRect/>
+                    </a:stretch>
+                  </pic:blipFill>
+                  <pic:spPr bwMode="auto">
+                    <a:xfrm>
+                      <a:off x="0" y="0"/>
+                      <a:ext cx="5612130" cy="8233410"/>
+                    </a:xfrm>
+                    <a:prstGeom prst="rect">
+                      <a:avLst/>
+                    </a:prstGeom>
+                    <a:noFill/>
+                    <a:ln>
+                      <a:noFill/>
+                    </a:ln>
+                  </pic:spPr>
+                </pic:pic>
+              </a:graphicData>
+            </a:graphic>
+          </wp:inline>
+        </w:drawing>
+      </w:r>
+    </w:p>
+    <w:p>
+      <w:pPr>
+        <w:rPr>
+          <w:lang w:val="es-ES"/>
+        </w:rPr>
+      </w:pPr>
+      <w:r>
+        <w:lastRenderedPageBreak/>
+        <w:drawing>
+          <wp:inline distT="0" distB="0" distL="0" distR="0" wp14:anchorId="799406FE" wp14:editId="3DED8C9D">
+            <wp:extent cx="5612130" cy="4046220"/>
+            <wp:effectExtent l="0" t="0" r="7620" b="0"/>
+            <wp:docPr id="2085716806" name="Imagen 25"/>
+            <wp:cNvGraphicFramePr>
+              <a:graphicFrameLocks xmlns:a="http://schemas.openxmlformats.org/drawingml/2006/main" noChangeAspect="1"/>
+            </wp:cNvGraphicFramePr>
+            <a:graphic xmlns:a="http://schemas.openxmlformats.org/drawingml/2006/main">
+              <a:graphicData uri="http://schemas.openxmlformats.org/drawingml/2006/picture">
+                <pic:pic xmlns:pic="http://schemas.openxmlformats.org/drawingml/2006/picture">
+                  <pic:nvPicPr>
+                    <pic:cNvPr id="0" name="Picture 33"/>
+                    <pic:cNvPicPr>
+                      <a:picLocks noChangeAspect="1" noChangeArrowheads="1"/>
+                    </pic:cNvPicPr>
+                  </pic:nvPicPr>
+                  <pic:blipFill>
+                    <a:blip r:embed="rId25">
+                      <a:extLst>
+                        <a:ext uri="{28A0092B-C50C-407E-A947-70E740481C1C}">
+                          <a14:useLocalDpi xmlns:a14="http://schemas.microsoft.com/office/drawing/2010/main" val="0"/>
+                        </a:ext>
+                      </a:extLst>
+                    </a:blip>
+                    <a:srcRect/>
+                    <a:stretch>
+                      <a:fillRect/>
+                    </a:stretch>
+                  </pic:blipFill>
+                  <pic:spPr bwMode="auto">
+                    <a:xfrm>
+                      <a:off x="0" y="0"/>
+                      <a:ext cx="5612130" cy="4046220"/>
+                    </a:xfrm>
+                    <a:prstGeom prst="rect">
+                      <a:avLst/>
+                    </a:prstGeom>
+                    <a:noFill/>
+                    <a:ln>
+                      <a:noFill/>
+                    </a:ln>
+                  </pic:spPr>
+                </pic:pic>
+              </a:graphicData>
+            </a:graphic>
+          </wp:inline>
+        </w:drawing>
+      </w:r>
+    </w:p>
+    <w:p>
+      <w:pPr>
+        <w:pStyle w:val="Ttulo1"/>
+        <w:rPr>
+          <w:rFonts w:ascii="Arial" w:hAnsi="Arial" w:cs="Arial"/>
+          <w:b/>
+          <w:bCs/>
+          <w:color w:val="auto"/>
+          <w:sz w:val="32"/>
+          <w:szCs w:val="32"/>
+          <w:lang w:val="es-ES"/>
+        </w:rPr>
+      </w:pPr>
+    </w:p>
+    <w:p>
+      <w:pPr>
+        <w:pStyle w:val="Ttulo1"/>
+        <w:rPr>
+          <w:rFonts w:ascii="Arial" w:hAnsi="Arial" w:cs="Arial"/>
+          <w:b/>
+          <w:bCs/>
+          <w:color w:val="auto"/>
+          <w:sz w:val="32"/>
+          <w:szCs w:val="32"/>
+          <w:lang w:val="es-ES"/>
+        </w:rPr>
+      </w:pPr>
+    </w:p>
+    <w:p>
+      <w:pPr>
+        <w:pStyle w:val="Ttulo1"/>
+        <w:rPr>
+          <w:rFonts w:ascii="Arial" w:hAnsi="Arial" w:cs="Arial"/>
+          <w:b/>
+          <w:bCs/>
+          <w:color w:val="auto"/>
+          <w:sz w:val="32"/>
+          <w:szCs w:val="32"/>
+          <w:lang w:val="es-ES"/>
+        </w:rPr>
+      </w:pPr>
+    </w:p>
+    <w:p>
+      <w:pPr>
+        <w:pStyle w:val="Ttulo1"/>
+        <w:rPr>
+          <w:rFonts w:ascii="Arial" w:hAnsi="Arial" w:cs="Arial"/>
+          <w:b/>
+          <w:bCs/>
+          <w:color w:val="auto"/>
+          <w:sz w:val="32"/>
+          <w:szCs w:val="32"/>
+          <w:lang w:val="es-ES"/>
+        </w:rPr>
+      </w:pPr>
+    </w:p>
+    <w:p>
+      <w:pPr>
+        <w:pStyle w:val="Ttulo1"/>
+        <w:rPr>
+          <w:rFonts w:ascii="Arial" w:hAnsi="Arial" w:cs="Arial"/>
+          <w:b/>
+          <w:bCs/>
+          <w:color w:val="auto"/>
+          <w:sz w:val="32"/>
+          <w:szCs w:val="32"/>
           <w:lang w:val="es-ES"/>
         </w:rPr>
       </w:pPr>
@@ -15204,7 +15280,6 @@
         <w:tc>
           <w:tcPr>
             <w:tcW w:w="0" w:type="auto"/>
-            <w:shd w:val="clear" w:color="auto" w:fill="auto"/>
             <w:vAlign w:val="center"/>
             <w:hideMark/>
           </w:tcPr>
@@ -15233,7 +15308,6 @@
         <w:tc>
           <w:tcPr>
             <w:tcW w:w="0" w:type="auto"/>
-            <w:shd w:val="clear" w:color="auto" w:fill="auto"/>
             <w:vAlign w:val="center"/>
             <w:hideMark/>
           </w:tcPr>
@@ -15262,7 +15336,6 @@
         <w:tc>
           <w:tcPr>
             <w:tcW w:w="0" w:type="auto"/>
-            <w:shd w:val="clear" w:color="auto" w:fill="auto"/>
             <w:vAlign w:val="center"/>
             <w:hideMark/>
           </w:tcPr>
@@ -15291,7 +15364,6 @@
         <w:tc>
           <w:tcPr>
             <w:tcW w:w="0" w:type="auto"/>
-            <w:shd w:val="clear" w:color="auto" w:fill="auto"/>
             <w:vAlign w:val="center"/>
             <w:hideMark/>
           </w:tcPr>
@@ -15320,7 +15392,6 @@
         <w:tc>
           <w:tcPr>
             <w:tcW w:w="0" w:type="auto"/>
-            <w:shd w:val="clear" w:color="auto" w:fill="auto"/>
             <w:vAlign w:val="center"/>
             <w:hideMark/>
           </w:tcPr>
@@ -15349,7 +15420,6 @@
         <w:tc>
           <w:tcPr>
             <w:tcW w:w="2447" w:type="dxa"/>
-            <w:shd w:val="clear" w:color="auto" w:fill="auto"/>
             <w:vAlign w:val="center"/>
             <w:hideMark/>
           </w:tcPr>
@@ -17724,7 +17794,7 @@
                     </pic:cNvPicPr>
                   </pic:nvPicPr>
                   <pic:blipFill>
-                    <a:blip r:embed="rId23">
+                    <a:blip r:embed="rId26">
                       <a:extLst>
                         <a:ext uri="{28A0092B-C50C-407E-A947-70E740481C1C}">
                           <a14:useLocalDpi xmlns:a14="http://schemas.microsoft.com/office/drawing/2010/main" val="0"/>
@@ -17857,7 +17927,7 @@
           <w:lang w:val="es-ES"/>
         </w:rPr>
         <w:sectPr>
-          <w:headerReference w:type="default" r:id="rId24"/>
+          <w:headerReference w:type="default" r:id="rId27"/>
           <w:pgSz w:w="12240" w:h="15840"/>
           <w:pgMar w:top="1417" w:right="1701" w:bottom="1417" w:left="1701" w:header="708" w:footer="708" w:gutter="0"/>
           <w:cols w:space="708"/>
@@ -17876,12 +17946,6 @@
           <w:sz w:val="32"/>
           <w:szCs w:val="32"/>
         </w:rPr>
-        <w:sectPr>
-          <w:pgSz w:w="12240" w:h="15840"/>
-          <w:pgMar w:top="1417" w:right="1701" w:bottom="1417" w:left="1701" w:header="708" w:footer="708" w:gutter="0"/>
-          <w:cols w:space="708"/>
-          <w:docGrid w:linePitch="360"/>
-        </w:sectPr>
       </w:pPr>
       <w:bookmarkStart w:id="32" w:name="_Toc210395324"/>
       <w:r>
@@ -18000,7 +18064,7 @@
                 <v:stroke joinstyle="miter"/>
                 <v:path gradientshapeok="t" o:connecttype="rect"/>
               </v:shapetype>
-              <v:shape id="Cuadro de texto 1" o:spid="_x0000_s1026" type="#_x0000_t202" style="position:absolute;margin-left:50.95pt;margin-top:592.9pt;width:333.25pt;height:.05pt;z-index:251668480;visibility:visible;mso-wrap-style:square;mso-wrap-distance-left:9pt;mso-wrap-distance-top:0;mso-wrap-distance-right:9pt;mso-wrap-distance-bottom:0;mso-position-horizontal:absolute;mso-position-horizontal-relative:text;mso-position-vertical:absolute;mso-position-vertical-relative:text;v-text-anchor:top" o:gfxdata="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" stroked="f">
+              <v:shape id="Cuadro de texto 1" o:spid="_x0000_s1026" type="#_x0000_t202" style="position:absolute;margin-left:50.95pt;margin-top:592.9pt;width:333.25pt;height:.05pt;z-index:251668480;visibility:visible;mso-wrap-style:square;mso-wrap-distance-left:9pt;mso-wrap-distance-top:0;mso-wrap-distance-right:9pt;mso-wrap-distance-bottom:0;mso-position-horizontal:absolute;mso-position-horizontal-relative:text;mso-position-vertical:absolute;mso-position-vertical-relative:text;v-text-anchor:top" o:gfxdata="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" stroked="f">
                 <v:textbox style="mso-fit-shape-to-text:t" inset="0,0,0,0">
                   <w:txbxContent>
                     <w:p>
@@ -18074,7 +18138,7 @@
           <w:szCs w:val="32"/>
         </w:rPr>
         <w:drawing>
-          <wp:anchor distT="0" distB="0" distL="114300" distR="114300" simplePos="0" relativeHeight="251658240" behindDoc="0" locked="0" layoutInCell="1" allowOverlap="1" wp14:anchorId="63E4B2B6" wp14:editId="5EE421B4">
+          <wp:anchor distT="0" distB="0" distL="114300" distR="114300" simplePos="0" relativeHeight="251658240" behindDoc="0" locked="0" layoutInCell="1" allowOverlap="1" wp14:anchorId="63E4B2B6" wp14:editId="33BF5053">
             <wp:simplePos x="0" y="0"/>
             <wp:positionH relativeFrom="column">
               <wp:posOffset>647065</wp:posOffset>
@@ -18099,7 +18163,7 @@
                     </pic:cNvPicPr>
                   </pic:nvPicPr>
                   <pic:blipFill>
-                    <a:blip r:embed="rId25" cstate="print">
+                    <a:blip r:embed="rId28" cstate="print">
                       <a:extLst>
                         <a:ext uri="{28A0092B-C50C-407E-A947-70E740481C1C}">
                           <a14:useLocalDpi xmlns:a14="http://schemas.microsoft.com/office/drawing/2010/main" val="0"/>
@@ -18149,6 +18213,17 @@
       </w:r>
       <w:bookmarkEnd w:id="32"/>
     </w:p>
+    <w:p/>
+    <w:p>
+      <w:pPr>
+        <w:sectPr>
+          <w:pgSz w:w="12240" w:h="15840"/>
+          <w:pgMar w:top="1417" w:right="1701" w:bottom="1417" w:left="1701" w:header="708" w:footer="708" w:gutter="0"/>
+          <w:cols w:space="708"/>
+          <w:docGrid w:linePitch="360"/>
+        </w:sectPr>
+      </w:pPr>
+    </w:p>
     <w:p>
       <w:pPr>
         <w:pStyle w:val="Ttulo1"/>
@@ -18175,225 +18250,137 @@
           <w:lang w:val="es-ES"/>
         </w:rPr>
         <w:lastRenderedPageBreak/>
-        <w:t>CONCLUSIONES</w:t>
-      </w:r>
-      <w:bookmarkEnd w:id="33"/>
-    </w:p>
-    <w:p>
-      <w:pPr>
-        <w:pStyle w:val="NormalWeb"/>
-        <w:jc w:val="both"/>
-      </w:pPr>
-      <w:r>
-        <w:rPr>
-          <w:rFonts w:hAnsi="Symbol"/>
-        </w:rPr>
-        <w:t></w:t>
-      </w:r>
-      <w:r>
-        <w:t xml:space="preserve"> La</w:t>
-      </w:r>
-      <w:r>
-        <w:t xml:space="preserve"> implementación de un sistema de control de producción permitirá a la empresa mejorar su eficiencia y evitar retrasos en la entrega de pedidos.</w:t>
-      </w:r>
-    </w:p>
-    <w:p>
-      <w:pPr>
-        <w:pStyle w:val="NormalWeb"/>
-        <w:jc w:val="both"/>
-      </w:pPr>
-      <w:r>
-        <w:rPr>
-          <w:rFonts w:hAnsi="Symbol"/>
-        </w:rPr>
-        <w:t></w:t>
-      </w:r>
-      <w:r>
-        <w:t xml:space="preserve"> Los</w:t>
-      </w:r>
-      <w:r>
-        <w:t xml:space="preserve"> supervisores contarán con información clara y en tiempo real para la toma de decisiones.</w:t>
-      </w:r>
-    </w:p>
-    <w:p>
-      <w:pPr>
-        <w:pStyle w:val="NormalWeb"/>
-        <w:jc w:val="both"/>
-      </w:pPr>
-      <w:r>
-        <w:rPr>
-          <w:rFonts w:hAnsi="Symbol"/>
-        </w:rPr>
-        <w:t></w:t>
-      </w:r>
-      <w:r>
-        <w:t xml:space="preserve"> Se</w:t>
-      </w:r>
-      <w:r>
-        <w:t xml:space="preserve"> mejorará la trazabilidad de la producción y se reducirán las pérdidas de información.</w:t>
-      </w:r>
-    </w:p>
-    <w:p>
-      <w:pPr>
-        <w:pStyle w:val="NormalWeb"/>
-        <w:jc w:val="both"/>
-      </w:pPr>
-      <w:r>
-        <w:rPr>
-          <w:rFonts w:hAnsi="Symbol"/>
-        </w:rPr>
-        <w:t></w:t>
-      </w:r>
-      <w:r>
-        <w:t xml:space="preserve"> El</w:t>
-      </w:r>
-      <w:r>
-        <w:t xml:space="preserve"> proyecto, al iniciar con una versión básica, sienta las bases para futuras ampliaciones como integración con inventario o análisis histórico avanzado.</w:t>
-      </w:r>
-    </w:p>
-    <w:p>
-      <w:pPr>
-        <w:rPr>
-          <w:rFonts w:ascii="Arial" w:hAnsi="Arial" w:cs="Arial"/>
-          <w:lang w:val="es-ES"/>
-        </w:rPr>
-      </w:pPr>
-    </w:p>
-    <w:p>
-      <w:pPr>
-        <w:rPr>
-          <w:rFonts w:ascii="Arial" w:hAnsi="Arial" w:cs="Arial"/>
-          <w:lang w:val="es-ES"/>
-        </w:rPr>
-      </w:pPr>
-    </w:p>
-    <w:p>
-      <w:pPr>
-        <w:rPr>
-          <w:rFonts w:ascii="Arial" w:hAnsi="Arial" w:cs="Arial"/>
-          <w:lang w:val="es-ES"/>
-        </w:rPr>
-      </w:pPr>
-    </w:p>
-    <w:p>
-      <w:pPr>
-        <w:rPr>
-          <w:rFonts w:ascii="Arial" w:hAnsi="Arial" w:cs="Arial"/>
-          <w:lang w:val="es-ES"/>
-        </w:rPr>
-      </w:pPr>
-    </w:p>
-    <w:p>
-      <w:pPr>
-        <w:rPr>
-          <w:rFonts w:ascii="Arial" w:hAnsi="Arial" w:cs="Arial"/>
-          <w:lang w:val="es-ES"/>
-        </w:rPr>
-      </w:pPr>
-    </w:p>
-    <w:p>
-      <w:pPr>
-        <w:rPr>
-          <w:rFonts w:ascii="Arial" w:hAnsi="Arial" w:cs="Arial"/>
-          <w:lang w:val="es-ES"/>
-        </w:rPr>
-      </w:pPr>
-    </w:p>
-    <w:p>
-      <w:pPr>
-        <w:rPr>
-          <w:rFonts w:ascii="Arial" w:hAnsi="Arial" w:cs="Arial"/>
-          <w:lang w:val="es-ES"/>
-        </w:rPr>
-      </w:pPr>
-    </w:p>
-    <w:p>
-      <w:pPr>
-        <w:rPr>
-          <w:rFonts w:ascii="Arial" w:hAnsi="Arial" w:cs="Arial"/>
-          <w:lang w:val="es-ES"/>
-        </w:rPr>
-      </w:pPr>
-    </w:p>
-    <w:p>
-      <w:pPr>
-        <w:rPr>
-          <w:rFonts w:ascii="Arial" w:hAnsi="Arial" w:cs="Arial"/>
-          <w:lang w:val="es-ES"/>
-        </w:rPr>
-      </w:pPr>
-    </w:p>
-    <w:p>
-      <w:pPr>
-        <w:rPr>
-          <w:rFonts w:ascii="Arial" w:hAnsi="Arial" w:cs="Arial"/>
-          <w:lang w:val="es-ES"/>
-        </w:rPr>
-      </w:pPr>
-    </w:p>
-    <w:p>
-      <w:pPr>
-        <w:rPr>
-          <w:rFonts w:ascii="Arial" w:hAnsi="Arial" w:cs="Arial"/>
-          <w:lang w:val="es-ES"/>
-        </w:rPr>
-      </w:pPr>
-    </w:p>
-    <w:p>
-      <w:pPr>
-        <w:rPr>
-          <w:rFonts w:ascii="Arial" w:hAnsi="Arial" w:cs="Arial"/>
-          <w:lang w:val="es-ES"/>
-        </w:rPr>
-      </w:pPr>
-    </w:p>
-    <w:p>
-      <w:pPr>
-        <w:rPr>
-          <w:rFonts w:ascii="Arial" w:hAnsi="Arial" w:cs="Arial"/>
-          <w:lang w:val="es-ES"/>
-        </w:rPr>
-      </w:pPr>
-    </w:p>
-    <w:p>
-      <w:pPr>
-        <w:rPr>
-          <w:rFonts w:ascii="Arial" w:hAnsi="Arial" w:cs="Arial"/>
-          <w:lang w:val="es-ES"/>
-        </w:rPr>
-      </w:pPr>
-    </w:p>
-    <w:p>
-      <w:pPr>
-        <w:rPr>
-          <w:rFonts w:ascii="Arial" w:hAnsi="Arial" w:cs="Arial"/>
-          <w:lang w:val="es-ES"/>
-        </w:rPr>
-      </w:pPr>
-    </w:p>
-    <w:p>
-      <w:pPr>
-        <w:rPr>
-          <w:rFonts w:ascii="Arial" w:hAnsi="Arial" w:cs="Arial"/>
-          <w:lang w:val="es-ES"/>
-        </w:rPr>
-      </w:pPr>
-    </w:p>
-    <w:p>
-      <w:pPr>
-        <w:rPr>
-          <w:rFonts w:ascii="Arial" w:hAnsi="Arial" w:cs="Arial"/>
-          <w:lang w:val="es-ES"/>
-        </w:rPr>
-      </w:pPr>
-    </w:p>
-    <w:p>
-      <w:pPr>
-        <w:rPr>
-          <w:rFonts w:ascii="Arial" w:hAnsi="Arial" w:cs="Arial"/>
-          <w:lang w:val="es-ES"/>
-        </w:rPr>
-      </w:pPr>
+        <w:t>Cronograma de Gantt</w:t>
+      </w:r>
+    </w:p>
+    <w:p>
+      <w:pPr>
+        <w:rPr>
+          <w:lang w:val="es-ES"/>
+        </w:rPr>
+      </w:pPr>
+      <w:r>
+        <w:drawing>
+          <wp:inline distT="0" distB="0" distL="0" distR="0" wp14:anchorId="282723D3" wp14:editId="35C642B7">
+            <wp:extent cx="5612130" cy="2237105"/>
+            <wp:effectExtent l="0" t="0" r="0" b="0"/>
+            <wp:docPr id="989603782" name="Imagen 15"/>
+            <wp:cNvGraphicFramePr>
+              <a:graphicFrameLocks xmlns:a="http://schemas.openxmlformats.org/drawingml/2006/main" noChangeAspect="1"/>
+            </wp:cNvGraphicFramePr>
+            <a:graphic xmlns:a="http://schemas.openxmlformats.org/drawingml/2006/main">
+              <a:graphicData uri="http://schemas.openxmlformats.org/drawingml/2006/picture">
+                <pic:pic xmlns:pic="http://schemas.openxmlformats.org/drawingml/2006/picture">
+                  <pic:nvPicPr>
+                    <pic:cNvPr id="0" name="Picture 13"/>
+                    <pic:cNvPicPr>
+                      <a:picLocks noChangeAspect="1" noChangeArrowheads="1"/>
+                    </pic:cNvPicPr>
+                  </pic:nvPicPr>
+                  <pic:blipFill>
+                    <a:blip r:embed="rId29">
+                      <a:extLst>
+                        <a:ext uri="{28A0092B-C50C-407E-A947-70E740481C1C}">
+                          <a14:useLocalDpi xmlns:a14="http://schemas.microsoft.com/office/drawing/2010/main" val="0"/>
+                        </a:ext>
+                      </a:extLst>
+                    </a:blip>
+                    <a:srcRect/>
+                    <a:stretch>
+                      <a:fillRect/>
+                    </a:stretch>
+                  </pic:blipFill>
+                  <pic:spPr bwMode="auto">
+                    <a:xfrm>
+                      <a:off x="0" y="0"/>
+                      <a:ext cx="5612130" cy="2237105"/>
+                    </a:xfrm>
+                    <a:prstGeom prst="rect">
+                      <a:avLst/>
+                    </a:prstGeom>
+                    <a:noFill/>
+                    <a:ln>
+                      <a:noFill/>
+                    </a:ln>
+                  </pic:spPr>
+                </pic:pic>
+              </a:graphicData>
+            </a:graphic>
+          </wp:inline>
+        </w:drawing>
+      </w:r>
+    </w:p>
+    <w:p>
+      <w:pPr>
+        <w:rPr>
+          <w:lang w:val="es-ES"/>
+        </w:rPr>
+      </w:pPr>
+    </w:p>
+    <w:p>
+      <w:pPr>
+        <w:rPr>
+          <w:lang w:val="es-ES"/>
+        </w:rPr>
+      </w:pPr>
+      <w:r>
+        <w:rPr>
+          <w:lang w:val="es-ES"/>
+        </w:rPr>
+        <w:t>Cronograma de Costos.</w:t>
+      </w:r>
+    </w:p>
+    <w:p>
+      <w:r>
+        <w:drawing>
+          <wp:inline distT="0" distB="0" distL="0" distR="0" wp14:anchorId="25CC8156" wp14:editId="3805816F">
+            <wp:extent cx="5612130" cy="648970"/>
+            <wp:effectExtent l="0" t="0" r="7620" b="0"/>
+            <wp:docPr id="519433032" name="Imagen 19"/>
+            <wp:cNvGraphicFramePr>
+              <a:graphicFrameLocks xmlns:a="http://schemas.openxmlformats.org/drawingml/2006/main" noChangeAspect="1"/>
+            </wp:cNvGraphicFramePr>
+            <a:graphic xmlns:a="http://schemas.openxmlformats.org/drawingml/2006/main">
+              <a:graphicData uri="http://schemas.openxmlformats.org/drawingml/2006/picture">
+                <pic:pic xmlns:pic="http://schemas.openxmlformats.org/drawingml/2006/picture">
+                  <pic:nvPicPr>
+                    <pic:cNvPr id="0" name="Picture 26"/>
+                    <pic:cNvPicPr>
+                      <a:picLocks noChangeAspect="1" noChangeArrowheads="1"/>
+                    </pic:cNvPicPr>
+                  </pic:nvPicPr>
+                  <pic:blipFill>
+                    <a:blip r:embed="rId30" cstate="print">
+                      <a:extLst>
+                        <a:ext uri="{28A0092B-C50C-407E-A947-70E740481C1C}">
+                          <a14:useLocalDpi xmlns:a14="http://schemas.microsoft.com/office/drawing/2010/main" val="0"/>
+                        </a:ext>
+                      </a:extLst>
+                    </a:blip>
+                    <a:srcRect/>
+                    <a:stretch>
+                      <a:fillRect/>
+                    </a:stretch>
+                  </pic:blipFill>
+                  <pic:spPr bwMode="auto">
+                    <a:xfrm>
+                      <a:off x="0" y="0"/>
+                      <a:ext cx="5612130" cy="648970"/>
+                    </a:xfrm>
+                    <a:prstGeom prst="rect">
+                      <a:avLst/>
+                    </a:prstGeom>
+                    <a:noFill/>
+                    <a:ln>
+                      <a:noFill/>
+                    </a:ln>
+                  </pic:spPr>
+                </pic:pic>
+              </a:graphicData>
+            </a:graphic>
+          </wp:inline>
+        </w:drawing>
+      </w:r>
     </w:p>
     <w:p>
       <w:pPr>
@@ -18408,8 +18395,10 @@
           <w:lang w:val="es-ES"/>
         </w:rPr>
       </w:pPr>
-      <w:bookmarkStart w:id="34" w:name="_Toc210395327"/>
-      <w:r>
+    </w:p>
+    <w:p>
+      <w:pPr>
+        <w:pStyle w:val="Ttulo1"/>
         <w:rPr>
           <w:rFonts w:ascii="Arial" w:hAnsi="Arial" w:cs="Arial"/>
           <w:b/>
@@ -18419,6 +18408,332 @@
           <w:szCs w:val="32"/>
           <w:lang w:val="es-ES"/>
         </w:rPr>
+      </w:pPr>
+    </w:p>
+    <w:p>
+      <w:pPr>
+        <w:pStyle w:val="Ttulo1"/>
+        <w:rPr>
+          <w:rFonts w:ascii="Arial" w:hAnsi="Arial" w:cs="Arial"/>
+          <w:b/>
+          <w:bCs/>
+          <w:color w:val="auto"/>
+          <w:sz w:val="32"/>
+          <w:szCs w:val="32"/>
+          <w:lang w:val="es-ES"/>
+        </w:rPr>
+      </w:pPr>
+    </w:p>
+    <w:p>
+      <w:pPr>
+        <w:pStyle w:val="Ttulo1"/>
+        <w:rPr>
+          <w:rFonts w:ascii="Arial" w:hAnsi="Arial" w:cs="Arial"/>
+          <w:b/>
+          <w:bCs/>
+          <w:color w:val="auto"/>
+          <w:sz w:val="32"/>
+          <w:szCs w:val="32"/>
+          <w:lang w:val="es-ES"/>
+        </w:rPr>
+      </w:pPr>
+    </w:p>
+    <w:p>
+      <w:pPr>
+        <w:pStyle w:val="Ttulo1"/>
+        <w:rPr>
+          <w:rFonts w:ascii="Arial" w:hAnsi="Arial" w:cs="Arial"/>
+          <w:b/>
+          <w:bCs/>
+          <w:color w:val="auto"/>
+          <w:sz w:val="32"/>
+          <w:szCs w:val="32"/>
+          <w:lang w:val="es-ES"/>
+        </w:rPr>
+      </w:pPr>
+    </w:p>
+    <w:p>
+      <w:pPr>
+        <w:rPr>
+          <w:lang w:val="es-ES"/>
+        </w:rPr>
+      </w:pPr>
+    </w:p>
+    <w:p>
+      <w:pPr>
+        <w:rPr>
+          <w:lang w:val="es-ES"/>
+        </w:rPr>
+      </w:pPr>
+    </w:p>
+    <w:p>
+      <w:pPr>
+        <w:pStyle w:val="Ttulo1"/>
+        <w:rPr>
+          <w:rFonts w:ascii="Arial" w:hAnsi="Arial" w:cs="Arial"/>
+          <w:b/>
+          <w:bCs/>
+          <w:color w:val="auto"/>
+          <w:sz w:val="32"/>
+          <w:szCs w:val="32"/>
+          <w:lang w:val="es-ES"/>
+        </w:rPr>
+      </w:pPr>
+      <w:r>
+        <w:rPr>
+          <w:rFonts w:ascii="Arial" w:hAnsi="Arial" w:cs="Arial"/>
+          <w:b/>
+          <w:bCs/>
+          <w:color w:val="auto"/>
+          <w:sz w:val="32"/>
+          <w:szCs w:val="32"/>
+          <w:lang w:val="es-ES"/>
+        </w:rPr>
+        <w:lastRenderedPageBreak/>
+        <w:t>CONCLUSIONES</w:t>
+      </w:r>
+      <w:bookmarkEnd w:id="33"/>
+    </w:p>
+    <w:p>
+      <w:pPr>
+        <w:pStyle w:val="NormalWeb"/>
+        <w:jc w:val="both"/>
+      </w:pPr>
+      <w:r>
+        <w:rPr>
+          <w:rFonts w:hAnsi="Symbol"/>
+        </w:rPr>
+        <w:t></w:t>
+      </w:r>
+      <w:r>
+        <w:t xml:space="preserve"> La</w:t>
+      </w:r>
+      <w:r>
+        <w:t xml:space="preserve"> implementación de un sistema de control de producción permitirá a la empresa mejorar su eficiencia y evitar retrasos en la entrega de pedidos.</w:t>
+      </w:r>
+    </w:p>
+    <w:p>
+      <w:pPr>
+        <w:pStyle w:val="NormalWeb"/>
+        <w:jc w:val="both"/>
+      </w:pPr>
+      <w:r>
+        <w:rPr>
+          <w:rFonts w:hAnsi="Symbol"/>
+        </w:rPr>
+        <w:t></w:t>
+      </w:r>
+      <w:r>
+        <w:t xml:space="preserve"> Los</w:t>
+      </w:r>
+      <w:r>
+        <w:t xml:space="preserve"> supervisores contarán con información clara y en tiempo real para la toma de decisiones.</w:t>
+      </w:r>
+    </w:p>
+    <w:p>
+      <w:pPr>
+        <w:pStyle w:val="NormalWeb"/>
+        <w:jc w:val="both"/>
+      </w:pPr>
+      <w:r>
+        <w:rPr>
+          <w:rFonts w:hAnsi="Symbol"/>
+        </w:rPr>
+        <w:t></w:t>
+      </w:r>
+      <w:r>
+        <w:t xml:space="preserve"> Se</w:t>
+      </w:r>
+      <w:r>
+        <w:t xml:space="preserve"> mejorará la trazabilidad de la producción y se reducirán las pérdidas de información.</w:t>
+      </w:r>
+    </w:p>
+    <w:p>
+      <w:pPr>
+        <w:pStyle w:val="NormalWeb"/>
+        <w:jc w:val="both"/>
+      </w:pPr>
+      <w:r>
+        <w:rPr>
+          <w:rFonts w:hAnsi="Symbol"/>
+        </w:rPr>
+        <w:t></w:t>
+      </w:r>
+      <w:r>
+        <w:t xml:space="preserve"> El</w:t>
+      </w:r>
+      <w:r>
+        <w:t xml:space="preserve"> proyecto, al iniciar con una versión básica, sienta las bases para futuras ampliaciones como integración con inventario o análisis histórico avanzado.</w:t>
+      </w:r>
+    </w:p>
+    <w:p>
+      <w:pPr>
+        <w:rPr>
+          <w:rFonts w:ascii="Arial" w:hAnsi="Arial" w:cs="Arial"/>
+          <w:lang w:val="es-ES"/>
+        </w:rPr>
+      </w:pPr>
+    </w:p>
+    <w:p>
+      <w:pPr>
+        <w:rPr>
+          <w:rFonts w:ascii="Arial" w:hAnsi="Arial" w:cs="Arial"/>
+          <w:lang w:val="es-ES"/>
+        </w:rPr>
+      </w:pPr>
+    </w:p>
+    <w:p>
+      <w:pPr>
+        <w:rPr>
+          <w:rFonts w:ascii="Arial" w:hAnsi="Arial" w:cs="Arial"/>
+          <w:lang w:val="es-ES"/>
+        </w:rPr>
+      </w:pPr>
+    </w:p>
+    <w:p>
+      <w:pPr>
+        <w:rPr>
+          <w:rFonts w:ascii="Arial" w:hAnsi="Arial" w:cs="Arial"/>
+          <w:lang w:val="es-ES"/>
+        </w:rPr>
+      </w:pPr>
+    </w:p>
+    <w:p>
+      <w:pPr>
+        <w:rPr>
+          <w:rFonts w:ascii="Arial" w:hAnsi="Arial" w:cs="Arial"/>
+          <w:lang w:val="es-ES"/>
+        </w:rPr>
+      </w:pPr>
+    </w:p>
+    <w:p>
+      <w:pPr>
+        <w:rPr>
+          <w:rFonts w:ascii="Arial" w:hAnsi="Arial" w:cs="Arial"/>
+          <w:lang w:val="es-ES"/>
+        </w:rPr>
+      </w:pPr>
+    </w:p>
+    <w:p>
+      <w:pPr>
+        <w:rPr>
+          <w:rFonts w:ascii="Arial" w:hAnsi="Arial" w:cs="Arial"/>
+          <w:lang w:val="es-ES"/>
+        </w:rPr>
+      </w:pPr>
+    </w:p>
+    <w:p>
+      <w:pPr>
+        <w:rPr>
+          <w:rFonts w:ascii="Arial" w:hAnsi="Arial" w:cs="Arial"/>
+          <w:lang w:val="es-ES"/>
+        </w:rPr>
+      </w:pPr>
+    </w:p>
+    <w:p>
+      <w:pPr>
+        <w:rPr>
+          <w:rFonts w:ascii="Arial" w:hAnsi="Arial" w:cs="Arial"/>
+          <w:lang w:val="es-ES"/>
+        </w:rPr>
+      </w:pPr>
+    </w:p>
+    <w:p>
+      <w:pPr>
+        <w:rPr>
+          <w:rFonts w:ascii="Arial" w:hAnsi="Arial" w:cs="Arial"/>
+          <w:lang w:val="es-ES"/>
+        </w:rPr>
+      </w:pPr>
+    </w:p>
+    <w:p>
+      <w:pPr>
+        <w:rPr>
+          <w:rFonts w:ascii="Arial" w:hAnsi="Arial" w:cs="Arial"/>
+          <w:lang w:val="es-ES"/>
+        </w:rPr>
+      </w:pPr>
+    </w:p>
+    <w:p>
+      <w:pPr>
+        <w:rPr>
+          <w:rFonts w:ascii="Arial" w:hAnsi="Arial" w:cs="Arial"/>
+          <w:lang w:val="es-ES"/>
+        </w:rPr>
+      </w:pPr>
+    </w:p>
+    <w:p>
+      <w:pPr>
+        <w:rPr>
+          <w:rFonts w:ascii="Arial" w:hAnsi="Arial" w:cs="Arial"/>
+          <w:lang w:val="es-ES"/>
+        </w:rPr>
+      </w:pPr>
+    </w:p>
+    <w:p>
+      <w:pPr>
+        <w:rPr>
+          <w:rFonts w:ascii="Arial" w:hAnsi="Arial" w:cs="Arial"/>
+          <w:lang w:val="es-ES"/>
+        </w:rPr>
+      </w:pPr>
+    </w:p>
+    <w:p>
+      <w:pPr>
+        <w:rPr>
+          <w:rFonts w:ascii="Arial" w:hAnsi="Arial" w:cs="Arial"/>
+          <w:lang w:val="es-ES"/>
+        </w:rPr>
+      </w:pPr>
+    </w:p>
+    <w:p>
+      <w:pPr>
+        <w:rPr>
+          <w:rFonts w:ascii="Arial" w:hAnsi="Arial" w:cs="Arial"/>
+          <w:lang w:val="es-ES"/>
+        </w:rPr>
+      </w:pPr>
+    </w:p>
+    <w:p>
+      <w:pPr>
+        <w:rPr>
+          <w:rFonts w:ascii="Arial" w:hAnsi="Arial" w:cs="Arial"/>
+          <w:lang w:val="es-ES"/>
+        </w:rPr>
+      </w:pPr>
+    </w:p>
+    <w:p>
+      <w:pPr>
+        <w:rPr>
+          <w:rFonts w:ascii="Arial" w:hAnsi="Arial" w:cs="Arial"/>
+          <w:lang w:val="es-ES"/>
+        </w:rPr>
+      </w:pPr>
+    </w:p>
+    <w:p>
+      <w:pPr>
+        <w:pStyle w:val="Ttulo1"/>
+        <w:rPr>
+          <w:rFonts w:ascii="Arial" w:hAnsi="Arial" w:cs="Arial"/>
+          <w:b/>
+          <w:bCs/>
+          <w:color w:val="auto"/>
+          <w:sz w:val="32"/>
+          <w:szCs w:val="32"/>
+          <w:lang w:val="es-ES"/>
+        </w:rPr>
+      </w:pPr>
+      <w:bookmarkStart w:id="34" w:name="_Toc210395327"/>
+      <w:r>
+        <w:rPr>
+          <w:rFonts w:ascii="Arial" w:hAnsi="Arial" w:cs="Arial"/>
+          <w:b/>
+          <w:bCs/>
+          <w:color w:val="auto"/>
+          <w:sz w:val="32"/>
+          <w:szCs w:val="32"/>
+          <w:lang w:val="es-ES"/>
+        </w:rPr>
         <w:lastRenderedPageBreak/>
         <w:t>ANEXOS</w:t>
       </w:r>
@@ -18445,7 +18760,7 @@
           <w:lang w:val="es-ES"/>
         </w:rPr>
       </w:pPr>
-      <w:hyperlink r:id="rId26" w:history="1">
+      <w:hyperlink r:id="rId31" w:history="1">
         <w:r>
           <w:rPr>
             <w:rStyle w:val="Hipervnculo"/>
@@ -18609,7 +18924,7 @@
                     <pic:cNvPicPr/>
                   </pic:nvPicPr>
                   <pic:blipFill rotWithShape="1">
-                    <a:blip r:embed="rId27" cstate="print">
+                    <a:blip r:embed="rId32" cstate="print">
                       <a:extLst>
                         <a:ext uri="{28A0092B-C50C-407E-A947-70E740481C1C}">
                           <a14:useLocalDpi xmlns:a14="http://schemas.microsoft.com/office/drawing/2010/main" val="0"/>
@@ -18687,7 +19002,7 @@
                     <pic:cNvPicPr/>
                   </pic:nvPicPr>
                   <pic:blipFill rotWithShape="1">
-                    <a:blip r:embed="rId28" cstate="print">
+                    <a:blip r:embed="rId33" cstate="print">
                       <a:extLst>
                         <a:ext uri="{28A0092B-C50C-407E-A947-70E740481C1C}">
                           <a14:useLocalDpi xmlns:a14="http://schemas.microsoft.com/office/drawing/2010/main" val="0"/>
@@ -18734,7 +19049,7 @@
           <w:lang w:val="es-ES"/>
         </w:rPr>
         <w:drawing>
-          <wp:anchor distT="0" distB="0" distL="114300" distR="114300" simplePos="0" relativeHeight="251676672" behindDoc="1" locked="0" layoutInCell="1" allowOverlap="1" wp14:anchorId="248841BB" wp14:editId="1A4E6E77">
+          <wp:anchor distT="0" distB="0" distL="114300" distR="114300" simplePos="0" relativeHeight="251676672" behindDoc="1" locked="0" layoutInCell="1" allowOverlap="1" wp14:anchorId="248841BB" wp14:editId="65A2DB2E">
             <wp:simplePos x="0" y="0"/>
             <wp:positionH relativeFrom="margin">
               <wp:align>left</wp:align>
@@ -18765,7 +19080,7 @@
                     <pic:cNvPicPr/>
                   </pic:nvPicPr>
                   <pic:blipFill>
-                    <a:blip r:embed="rId29" cstate="print">
+                    <a:blip r:embed="rId34" cstate="print">
                       <a:extLst>
                         <a:ext uri="{28A0092B-C50C-407E-A947-70E740481C1C}">
                           <a14:useLocalDpi xmlns:a14="http://schemas.microsoft.com/office/drawing/2010/main" val="0"/>
@@ -19149,7 +19464,7 @@
 </file>
 
 <file path=word/endnotes.xml><?xml version="1.0" encoding="utf-8"?>
-<w:endnotes xmlns:wpc="http://schemas.microsoft.com/office/word/2010/wordprocessingCanvas" xmlns:cx="http://schemas.microsoft.com/office/drawing/2014/chartex" xmlns:cx1="http://schemas.microsoft.com/office/drawing/2015/9/8/chartex" xmlns:cx2="http://schemas.microsoft.com/office/drawing/2015/10/21/chartex" xmlns:cx3="http://schemas.microsoft.com/office/drawing/2016/5/9/chartex" xmlns:cx4="http://schemas.microsoft.com/office/drawing/2016/5/10/chartex" xmlns:cx5="http://schemas.microsoft.com/office/drawing/2016/5/11/chartex" xmlns:cx6="http://schemas.microsoft.com/office/drawing/2016/5/12/chartex" xmlns:cx7="http://schemas.microsoft.com/office/drawing/2016/5/13/chartex" xmlns:cx8="http://schemas.microsoft.com/office/drawing/2016/5/14/chartex" xmlns:mc="http://schemas.openxmlformats.org/markup-compatibility/2006" xmlns:aink="http://schemas.microsoft.com/office/drawing/2016/ink" xmlns:am3d="http://schemas.microsoft.com/office/drawing/2017/model3d" xmlns:o="urn:schemas-microsoft-com:office:office" xmlns:r="http://schemas.openxmlformats.org/officeDocument/2006/relationships" xmlns:m="http://schemas.openxmlformats.org/officeDocument/2006/math" xmlns:v="urn:schemas-microsoft-com:vml" xmlns:wp14="http://schemas.microsoft.com/office/word/2010/wordprocessingDrawing" xmlns:wp="http://schemas.openxmlformats.org/drawingml/2006/wordprocessingDrawing" xmlns:w10="urn:schemas-microsoft-com:office:word" xmlns:w="http://schemas.openxmlformats.org/wordprocessingml/2006/main" xmlns:w14="http://schemas.microsoft.com/office/word/2010/wordml" xmlns:w15="http://schemas.microsoft.com/office/word/2012/wordml" xmlns:w16cex="http://schemas.microsoft.com/office/word/2018/wordml/cex" xmlns:w16cid="http://schemas.microsoft.com/office/word/2016/wordml/cid" xmlns:w16="http://schemas.microsoft.com/office/word/2018/wordml" xmlns:w16sdtdh="http://schemas.microsoft.com/office/word/2020/wordml/sdtdatahash" xmlns:w16se="http://schemas.microsoft.com/office/word/2015/wordml/symex" xmlns:wpg="http://schemas.microsoft.com/office/word/2010/wordprocessingGroup" xmlns:wpi="http://schemas.microsoft.com/office/word/2010/wordprocessingInk" xmlns:wne="http://schemas.microsoft.com/office/word/2006/wordml" xmlns:wps="http://schemas.microsoft.com/office/word/2010/wordprocessingShape" mc:Ignorable="w14 w15 w16se w16cid w16 w16cex w16sdtdh wp14">
+<w:endnotes xmlns:wpc="http://schemas.microsoft.com/office/word/2010/wordprocessingCanvas" xmlns:cx="http://schemas.microsoft.com/office/drawing/2014/chartex" xmlns:cx1="http://schemas.microsoft.com/office/drawing/2015/9/8/chartex" xmlns:cx2="http://schemas.microsoft.com/office/drawing/2015/10/21/chartex" xmlns:cx3="http://schemas.microsoft.com/office/drawing/2016/5/9/chartex" xmlns:cx4="http://schemas.microsoft.com/office/drawing/2016/5/10/chartex" xmlns:cx5="http://schemas.microsoft.com/office/drawing/2016/5/11/chartex" xmlns:cx6="http://schemas.microsoft.com/office/drawing/2016/5/12/chartex" xmlns:cx7="http://schemas.microsoft.com/office/drawing/2016/5/13/chartex" xmlns:cx8="http://schemas.microsoft.com/office/drawing/2016/5/14/chartex" xmlns:mc="http://schemas.openxmlformats.org/markup-compatibility/2006" xmlns:aink="http://schemas.microsoft.com/office/drawing/2016/ink" xmlns:am3d="http://schemas.microsoft.com/office/drawing/2017/model3d" xmlns:o="urn:schemas-microsoft-com:office:office" xmlns:oel="http://schemas.microsoft.com/office/2019/extlst" xmlns:r="http://schemas.openxmlformats.org/officeDocument/2006/relationships" xmlns:m="http://schemas.openxmlformats.org/officeDocument/2006/math" xmlns:v="urn:schemas-microsoft-com:vml" xmlns:wp14="http://schemas.microsoft.com/office/word/2010/wordprocessingDrawing" xmlns:wp="http://schemas.openxmlformats.org/drawingml/2006/wordprocessingDrawing" xmlns:w10="urn:schemas-microsoft-com:office:word" xmlns:w="http://schemas.openxmlformats.org/wordprocessingml/2006/main" xmlns:w14="http://schemas.microsoft.com/office/word/2010/wordml" xmlns:w15="http://schemas.microsoft.com/office/word/2012/wordml" xmlns:w16cex="http://schemas.microsoft.com/office/word/2018/wordml/cex" xmlns:w16cid="http://schemas.microsoft.com/office/word/2016/wordml/cid" xmlns:w16="http://schemas.microsoft.com/office/word/2018/wordml" xmlns:w16du="http://schemas.microsoft.com/office/word/2023/wordml/word16du" xmlns:w16sdtdh="http://schemas.microsoft.com/office/word/2020/wordml/sdtdatahash" xmlns:w16sdtfl="http://schemas.microsoft.com/office/word/2024/wordml/sdtformatlock" xmlns:w16se="http://schemas.microsoft.com/office/word/2015/wordml/symex" xmlns:wpg="http://schemas.microsoft.com/office/word/2010/wordprocessingGroup" xmlns:wpi="http://schemas.microsoft.com/office/word/2010/wordprocessingInk" xmlns:wne="http://schemas.microsoft.com/office/word/2006/wordml" xmlns:wps="http://schemas.microsoft.com/office/word/2010/wordprocessingShape" mc:Ignorable="w14 w15 w16se w16cid w16 w16cex w16sdtdh w16sdtfl w16du wp14">
   <w:endnote w:type="separator" w:id="-1">
     <w:p>
       <w:pPr>
@@ -19174,7 +19489,7 @@
 </file>
 
 <file path=word/footnotes.xml><?xml version="1.0" encoding="utf-8"?>
-<w:footnotes xmlns:wpc="http://schemas.microsoft.com/office/word/2010/wordprocessingCanvas" xmlns:cx="http://schemas.microsoft.com/office/drawing/2014/chartex" xmlns:cx1="http://schemas.microsoft.com/office/drawing/2015/9/8/chartex" xmlns:cx2="http://schemas.microsoft.com/office/drawing/2015/10/21/chartex" xmlns:cx3="http://schemas.microsoft.com/office/drawing/2016/5/9/chartex" xmlns:cx4="http://schemas.microsoft.com/office/drawing/2016/5/10/chartex" xmlns:cx5="http://schemas.microsoft.com/office/drawing/2016/5/11/chartex" xmlns:cx6="http://schemas.microsoft.com/office/drawing/2016/5/12/chartex" xmlns:cx7="http://schemas.microsoft.com/office/drawing/2016/5/13/chartex" xmlns:cx8="http://schemas.microsoft.com/office/drawing/2016/5/14/chartex" xmlns:mc="http://schemas.openxmlformats.org/markup-compatibility/2006" xmlns:aink="http://schemas.microsoft.com/office/drawing/2016/ink" xmlns:am3d="http://schemas.microsoft.com/office/drawing/2017/model3d" xmlns:o="urn:schemas-microsoft-com:office:office" xmlns:r="http://schemas.openxmlformats.org/officeDocument/2006/relationships" xmlns:m="http://schemas.openxmlformats.org/officeDocument/2006/math" xmlns:v="urn:schemas-microsoft-com:vml" xmlns:wp14="http://schemas.microsoft.com/office/word/2010/wordprocessingDrawing" xmlns:wp="http://schemas.openxmlformats.org/drawingml/2006/wordprocessingDrawing" xmlns:w10="urn:schemas-microsoft-com:office:word" xmlns:w="http://schemas.openxmlformats.org/wordprocessingml/2006/main" xmlns:w14="http://schemas.microsoft.com/office/word/2010/wordml" xmlns:w15="http://schemas.microsoft.com/office/word/2012/wordml" xmlns:w16cex="http://schemas.microsoft.com/office/word/2018/wordml/cex" xmlns:w16cid="http://schemas.microsoft.com/office/word/2016/wordml/cid" xmlns:w16="http://schemas.microsoft.com/office/word/2018/wordml" xmlns:w16sdtdh="http://schemas.microsoft.com/office/word/2020/wordml/sdtdatahash" xmlns:w16se="http://schemas.microsoft.com/office/word/2015/wordml/symex" xmlns:wpg="http://schemas.microsoft.com/office/word/2010/wordprocessingGroup" xmlns:wpi="http://schemas.microsoft.com/office/word/2010/wordprocessingInk" xmlns:wne="http://schemas.microsoft.com/office/word/2006/wordml" xmlns:wps="http://schemas.microsoft.com/office/word/2010/wordprocessingShape" mc:Ignorable="w14 w15 w16se w16cid w16 w16cex w16sdtdh wp14">
+<w:footnotes xmlns:wpc="http://schemas.microsoft.com/office/word/2010/wordprocessingCanvas" xmlns:cx="http://schemas.microsoft.com/office/drawing/2014/chartex" xmlns:cx1="http://schemas.microsoft.com/office/drawing/2015/9/8/chartex" xmlns:cx2="http://schemas.microsoft.com/office/drawing/2015/10/21/chartex" xmlns:cx3="http://schemas.microsoft.com/office/drawing/2016/5/9/chartex" xmlns:cx4="http://schemas.microsoft.com/office/drawing/2016/5/10/chartex" xmlns:cx5="http://schemas.microsoft.com/office/drawing/2016/5/11/chartex" xmlns:cx6="http://schemas.microsoft.com/office/drawing/2016/5/12/chartex" xmlns:cx7="http://schemas.microsoft.com/office/drawing/2016/5/13/chartex" xmlns:cx8="http://schemas.microsoft.com/office/drawing/2016/5/14/chartex" xmlns:mc="http://schemas.openxmlformats.org/markup-compatibility/2006" xmlns:aink="http://schemas.microsoft.com/office/drawing/2016/ink" xmlns:am3d="http://schemas.microsoft.com/office/drawing/2017/model3d" xmlns:o="urn:schemas-microsoft-com:office:office" xmlns:oel="http://schemas.microsoft.com/office/2019/extlst" xmlns:r="http://schemas.openxmlformats.org/officeDocument/2006/relationships" xmlns:m="http://schemas.openxmlformats.org/officeDocument/2006/math" xmlns:v="urn:schemas-microsoft-com:vml" xmlns:wp14="http://schemas.microsoft.com/office/word/2010/wordprocessingDrawing" xmlns:wp="http://schemas.openxmlformats.org/drawingml/2006/wordprocessingDrawing" xmlns:w10="urn:schemas-microsoft-com:office:word" xmlns:w="http://schemas.openxmlformats.org/wordprocessingml/2006/main" xmlns:w14="http://schemas.microsoft.com/office/word/2010/wordml" xmlns:w15="http://schemas.microsoft.com/office/word/2012/wordml" xmlns:w16cex="http://schemas.microsoft.com/office/word/2018/wordml/cex" xmlns:w16cid="http://schemas.microsoft.com/office/word/2016/wordml/cid" xmlns:w16="http://schemas.microsoft.com/office/word/2018/wordml" xmlns:w16du="http://schemas.microsoft.com/office/word/2023/wordml/word16du" xmlns:w16sdtdh="http://schemas.microsoft.com/office/word/2020/wordml/sdtdatahash" xmlns:w16sdtfl="http://schemas.microsoft.com/office/word/2024/wordml/sdtformatlock" xmlns:w16se="http://schemas.microsoft.com/office/word/2015/wordml/symex" xmlns:wpg="http://schemas.microsoft.com/office/word/2010/wordprocessingGroup" xmlns:wpi="http://schemas.microsoft.com/office/word/2010/wordprocessingInk" xmlns:wne="http://schemas.microsoft.com/office/word/2006/wordml" xmlns:wps="http://schemas.microsoft.com/office/word/2010/wordprocessingShape" mc:Ignorable="w14 w15 w16se w16cid w16 w16cex w16sdtdh w16sdtfl w16du wp14">
   <w:footnote w:type="separator" w:id="-1">
     <w:p>
       <w:pPr>
@@ -19199,7 +19514,7 @@
 </file>
 
 <file path=word/header1.xml><?xml version="1.0" encoding="utf-8"?>
-<w:hdr xmlns:wpc="http://schemas.microsoft.com/office/word/2010/wordprocessingCanvas" xmlns:cx="http://schemas.microsoft.com/office/drawing/2014/chartex" xmlns:cx1="http://schemas.microsoft.com/office/drawing/2015/9/8/chartex" xmlns:cx2="http://schemas.microsoft.com/office/drawing/2015/10/21/chartex" xmlns:cx3="http://schemas.microsoft.com/office/drawing/2016/5/9/chartex" xmlns:cx4="http://schemas.microsoft.com/office/drawing/2016/5/10/chartex" xmlns:cx5="http://schemas.microsoft.com/office/drawing/2016/5/11/chartex" xmlns:cx6="http://schemas.microsoft.com/office/drawing/2016/5/12/chartex" xmlns:cx7="http://schemas.microsoft.com/office/drawing/2016/5/13/chartex" xmlns:cx8="http://schemas.microsoft.com/office/drawing/2016/5/14/chartex" xmlns:mc="http://schemas.openxmlformats.org/markup-compatibility/2006" xmlns:aink="http://schemas.microsoft.com/office/drawing/2016/ink" xmlns:am3d="http://schemas.microsoft.com/office/drawing/2017/model3d" xmlns:o="urn:schemas-microsoft-com:office:office" xmlns:r="http://schemas.openxmlformats.org/officeDocument/2006/relationships" xmlns:m="http://schemas.openxmlformats.org/officeDocument/2006/math" xmlns:v="urn:schemas-microsoft-com:vml" xmlns:wp14="http://schemas.microsoft.com/office/word/2010/wordprocessingDrawing" xmlns:wp="http://schemas.openxmlformats.org/drawingml/2006/wordprocessingDrawing" xmlns:w10="urn:schemas-microsoft-com:office:word" xmlns:w="http://schemas.openxmlformats.org/wordprocessingml/2006/main" xmlns:w14="http://schemas.microsoft.com/office/word/2010/wordml" xmlns:w15="http://schemas.microsoft.com/office/word/2012/wordml" xmlns:w16cex="http://schemas.microsoft.com/office/word/2018/wordml/cex" xmlns:w16cid="http://schemas.microsoft.com/office/word/2016/wordml/cid" xmlns:w16="http://schemas.microsoft.com/office/word/2018/wordml" xmlns:w16sdtdh="http://schemas.microsoft.com/office/word/2020/wordml/sdtdatahash" xmlns:w16se="http://schemas.microsoft.com/office/word/2015/wordml/symex" xmlns:wpg="http://schemas.microsoft.com/office/word/2010/wordprocessingGroup" xmlns:wpi="http://schemas.microsoft.com/office/word/2010/wordprocessingInk" xmlns:wne="http://schemas.microsoft.com/office/word/2006/wordml" xmlns:wps="http://schemas.microsoft.com/office/word/2010/wordprocessingShape" mc:Ignorable="w14 w15 w16se w16cid w16 w16cex w16sdtdh wp14">
+<w:hdr xmlns:wpc="http://schemas.microsoft.com/office/word/2010/wordprocessingCanvas" xmlns:cx="http://schemas.microsoft.com/office/drawing/2014/chartex" xmlns:cx1="http://schemas.microsoft.com/office/drawing/2015/9/8/chartex" xmlns:cx2="http://schemas.microsoft.com/office/drawing/2015/10/21/chartex" xmlns:cx3="http://schemas.microsoft.com/office/drawing/2016/5/9/chartex" xmlns:cx4="http://schemas.microsoft.com/office/drawing/2016/5/10/chartex" xmlns:cx5="http://schemas.microsoft.com/office/drawing/2016/5/11/chartex" xmlns:cx6="http://schemas.microsoft.com/office/drawing/2016/5/12/chartex" xmlns:cx7="http://schemas.microsoft.com/office/drawing/2016/5/13/chartex" xmlns:cx8="http://schemas.microsoft.com/office/drawing/2016/5/14/chartex" xmlns:mc="http://schemas.openxmlformats.org/markup-compatibility/2006" xmlns:aink="http://schemas.microsoft.com/office/drawing/2016/ink" xmlns:am3d="http://schemas.microsoft.com/office/drawing/2017/model3d" xmlns:o="urn:schemas-microsoft-com:office:office" xmlns:oel="http://schemas.microsoft.com/office/2019/extlst" xmlns:r="http://schemas.openxmlformats.org/officeDocument/2006/relationships" xmlns:m="http://schemas.openxmlformats.org/officeDocument/2006/math" xmlns:v="urn:schemas-microsoft-com:vml" xmlns:wp14="http://schemas.microsoft.com/office/word/2010/wordprocessingDrawing" xmlns:wp="http://schemas.openxmlformats.org/drawingml/2006/wordprocessingDrawing" xmlns:w10="urn:schemas-microsoft-com:office:word" xmlns:w="http://schemas.openxmlformats.org/wordprocessingml/2006/main" xmlns:w14="http://schemas.microsoft.com/office/word/2010/wordml" xmlns:w15="http://schemas.microsoft.com/office/word/2012/wordml" xmlns:w16cex="http://schemas.microsoft.com/office/word/2018/wordml/cex" xmlns:w16cid="http://schemas.microsoft.com/office/word/2016/wordml/cid" xmlns:w16="http://schemas.microsoft.com/office/word/2018/wordml" xmlns:w16du="http://schemas.microsoft.com/office/word/2023/wordml/word16du" xmlns:w16sdtdh="http://schemas.microsoft.com/office/word/2020/wordml/sdtdatahash" xmlns:w16sdtfl="http://schemas.microsoft.com/office/word/2024/wordml/sdtformatlock" xmlns:w16se="http://schemas.microsoft.com/office/word/2015/wordml/symex" xmlns:wpg="http://schemas.microsoft.com/office/word/2010/wordprocessingGroup" xmlns:wpi="http://schemas.microsoft.com/office/word/2010/wordprocessingInk" xmlns:wne="http://schemas.microsoft.com/office/word/2006/wordml" xmlns:wps="http://schemas.microsoft.com/office/word/2010/wordprocessingShape" mc:Ignorable="w14 w15 w16se w16cid w16 w16cex w16sdtdh w16sdtfl w16du wp14">
   <w:sdt>
     <w:sdtPr>
       <w:id w:val="1114945457"/>
@@ -19208,7 +19523,6 @@
         <w:docPartUnique/>
       </w:docPartObj>
     </w:sdtPr>
-    <w:sdtEndPr/>
     <w:sdtContent>
       <w:p>
         <w:pPr>
@@ -19249,7 +19563,7 @@
 </file>
 
 <file path=word/numbering.xml><?xml version="1.0" encoding="utf-8"?>
-<w:numbering xmlns:wpc="http://schemas.microsoft.com/office/word/2010/wordprocessingCanvas" xmlns:cx="http://schemas.microsoft.com/office/drawing/2014/chartex" xmlns:cx1="http://schemas.microsoft.com/office/drawing/2015/9/8/chartex" xmlns:cx2="http://schemas.microsoft.com/office/drawing/2015/10/21/chartex" xmlns:cx3="http://schemas.microsoft.com/office/drawing/2016/5/9/chartex" xmlns:cx4="http://schemas.microsoft.com/office/drawing/2016/5/10/chartex" xmlns:cx5="http://schemas.microsoft.com/office/drawing/2016/5/11/chartex" xmlns:cx6="http://schemas.microsoft.com/office/drawing/2016/5/12/chartex" xmlns:cx7="http://schemas.microsoft.com/office/drawing/2016/5/13/chartex" xmlns:cx8="http://schemas.microsoft.com/office/drawing/2016/5/14/chartex" xmlns:mc="http://schemas.openxmlformats.org/markup-compatibility/2006" xmlns:aink="http://schemas.microsoft.com/office/drawing/2016/ink" xmlns:am3d="http://schemas.microsoft.com/office/drawing/2017/model3d" xmlns:o="urn:schemas-microsoft-com:office:office" xmlns:r="http://schemas.openxmlformats.org/officeDocument/2006/relationships" xmlns:m="http://schemas.openxmlformats.org/officeDocument/2006/math" xmlns:v="urn:schemas-microsoft-com:vml" xmlns:wp14="http://schemas.microsoft.com/office/word/2010/wordprocessingDrawing" xmlns:wp="http://schemas.openxmlformats.org/drawingml/2006/wordprocessingDrawing" xmlns:w10="urn:schemas-microsoft-com:office:word" xmlns:w="http://schemas.openxmlformats.org/wordprocessingml/2006/main" xmlns:w14="http://schemas.microsoft.com/office/word/2010/wordml" xmlns:w15="http://schemas.microsoft.com/office/word/2012/wordml" xmlns:w16cex="http://schemas.microsoft.com/office/word/2018/wordml/cex" xmlns:w16cid="http://schemas.microsoft.com/office/word/2016/wordml/cid" xmlns:w16="http://schemas.microsoft.com/office/word/2018/wordml" xmlns:w16sdtdh="http://schemas.microsoft.com/office/word/2020/wordml/sdtdatahash" xmlns:w16se="http://schemas.microsoft.com/office/word/2015/wordml/symex" xmlns:wpg="http://schemas.microsoft.com/office/word/2010/wordprocessingGroup" xmlns:wpi="http://schemas.microsoft.com/office/word/2010/wordprocessingInk" xmlns:wne="http://schemas.microsoft.com/office/word/2006/wordml" xmlns:wps="http://schemas.microsoft.com/office/word/2010/wordprocessingShape" mc:Ignorable="w14 w15 w16se w16cid w16 w16cex w16sdtdh wp14">
+<w:numbering xmlns:wpc="http://schemas.microsoft.com/office/word/2010/wordprocessingCanvas" xmlns:cx="http://schemas.microsoft.com/office/drawing/2014/chartex" xmlns:cx1="http://schemas.microsoft.com/office/drawing/2015/9/8/chartex" xmlns:cx2="http://schemas.microsoft.com/office/drawing/2015/10/21/chartex" xmlns:cx3="http://schemas.microsoft.com/office/drawing/2016/5/9/chartex" xmlns:cx4="http://schemas.microsoft.com/office/drawing/2016/5/10/chartex" xmlns:cx5="http://schemas.microsoft.com/office/drawing/2016/5/11/chartex" xmlns:cx6="http://schemas.microsoft.com/office/drawing/2016/5/12/chartex" xmlns:cx7="http://schemas.microsoft.com/office/drawing/2016/5/13/chartex" xmlns:cx8="http://schemas.microsoft.com/office/drawing/2016/5/14/chartex" xmlns:mc="http://schemas.openxmlformats.org/markup-compatibility/2006" xmlns:aink="http://schemas.microsoft.com/office/drawing/2016/ink" xmlns:am3d="http://schemas.microsoft.com/office/drawing/2017/model3d" xmlns:o="urn:schemas-microsoft-com:office:office" xmlns:oel="http://schemas.microsoft.com/office/2019/extlst" xmlns:r="http://schemas.openxmlformats.org/officeDocument/2006/relationships" xmlns:m="http://schemas.openxmlformats.org/officeDocument/2006/math" xmlns:v="urn:schemas-microsoft-com:vml" xmlns:wp14="http://schemas.microsoft.com/office/word/2010/wordprocessingDrawing" xmlns:wp="http://schemas.openxmlformats.org/drawingml/2006/wordprocessingDrawing" xmlns:w10="urn:schemas-microsoft-com:office:word" xmlns:w="http://schemas.openxmlformats.org/wordprocessingml/2006/main" xmlns:w14="http://schemas.microsoft.com/office/word/2010/wordml" xmlns:w15="http://schemas.microsoft.com/office/word/2012/wordml" xmlns:w16cex="http://schemas.microsoft.com/office/word/2018/wordml/cex" xmlns:w16cid="http://schemas.microsoft.com/office/word/2016/wordml/cid" xmlns:w16="http://schemas.microsoft.com/office/word/2018/wordml" xmlns:w16du="http://schemas.microsoft.com/office/word/2023/wordml/word16du" xmlns:w16sdtdh="http://schemas.microsoft.com/office/word/2020/wordml/sdtdatahash" xmlns:w16sdtfl="http://schemas.microsoft.com/office/word/2024/wordml/sdtformatlock" xmlns:w16se="http://schemas.microsoft.com/office/word/2015/wordml/symex" xmlns:wpg="http://schemas.microsoft.com/office/word/2010/wordprocessingGroup" xmlns:wpi="http://schemas.microsoft.com/office/word/2010/wordprocessingInk" xmlns:wne="http://schemas.microsoft.com/office/word/2006/wordml" xmlns:wps="http://schemas.microsoft.com/office/word/2010/wordprocessingShape" mc:Ignorable="w14 w15 w16se w16cid w16 w16cex w16sdtdh w16sdtfl w16du wp14">
   <w:abstractNum w:abstractNumId="0" w15:restartNumberingAfterBreak="0">
     <w:nsid w:val="09344707"/>
     <w:multiLevelType w:val="multilevel"/>
@@ -23685,109 +23999,109 @@
       </w:rPr>
     </w:lvl>
   </w:abstractNum>
-  <w:num w:numId="1">
+  <w:num w:numId="1" w16cid:durableId="1315716901">
     <w:abstractNumId w:val="18"/>
   </w:num>
-  <w:num w:numId="2">
+  <w:num w:numId="2" w16cid:durableId="1831485209">
     <w:abstractNumId w:val="30"/>
   </w:num>
-  <w:num w:numId="3">
+  <w:num w:numId="3" w16cid:durableId="23751387">
     <w:abstractNumId w:val="23"/>
   </w:num>
-  <w:num w:numId="4">
+  <w:num w:numId="4" w16cid:durableId="461314763">
     <w:abstractNumId w:val="29"/>
   </w:num>
-  <w:num w:numId="5">
+  <w:num w:numId="5" w16cid:durableId="1791246255">
     <w:abstractNumId w:val="7"/>
   </w:num>
-  <w:num w:numId="6">
+  <w:num w:numId="6" w16cid:durableId="1697341399">
     <w:abstractNumId w:val="26"/>
   </w:num>
-  <w:num w:numId="7">
+  <w:num w:numId="7" w16cid:durableId="2089691220">
     <w:abstractNumId w:val="16"/>
   </w:num>
-  <w:num w:numId="8">
+  <w:num w:numId="8" w16cid:durableId="1069964751">
     <w:abstractNumId w:val="31"/>
   </w:num>
-  <w:num w:numId="9">
+  <w:num w:numId="9" w16cid:durableId="1697924302">
     <w:abstractNumId w:val="11"/>
   </w:num>
-  <w:num w:numId="10">
+  <w:num w:numId="10" w16cid:durableId="438260111">
     <w:abstractNumId w:val="0"/>
   </w:num>
-  <w:num w:numId="11">
+  <w:num w:numId="11" w16cid:durableId="1217203068">
     <w:abstractNumId w:val="9"/>
   </w:num>
-  <w:num w:numId="12">
+  <w:num w:numId="12" w16cid:durableId="767846734">
     <w:abstractNumId w:val="3"/>
   </w:num>
-  <w:num w:numId="13">
+  <w:num w:numId="13" w16cid:durableId="1627083539">
     <w:abstractNumId w:val="33"/>
   </w:num>
-  <w:num w:numId="14">
+  <w:num w:numId="14" w16cid:durableId="1112896053">
     <w:abstractNumId w:val="10"/>
   </w:num>
-  <w:num w:numId="15">
+  <w:num w:numId="15" w16cid:durableId="523597391">
     <w:abstractNumId w:val="4"/>
   </w:num>
-  <w:num w:numId="16">
+  <w:num w:numId="16" w16cid:durableId="1026836368">
     <w:abstractNumId w:val="15"/>
   </w:num>
-  <w:num w:numId="17">
+  <w:num w:numId="17" w16cid:durableId="31271076">
     <w:abstractNumId w:val="20"/>
   </w:num>
-  <w:num w:numId="18">
+  <w:num w:numId="18" w16cid:durableId="344668603">
     <w:abstractNumId w:val="25"/>
   </w:num>
-  <w:num w:numId="19">
+  <w:num w:numId="19" w16cid:durableId="75132838">
     <w:abstractNumId w:val="14"/>
   </w:num>
-  <w:num w:numId="20">
+  <w:num w:numId="20" w16cid:durableId="816409940">
     <w:abstractNumId w:val="5"/>
   </w:num>
-  <w:num w:numId="21">
+  <w:num w:numId="21" w16cid:durableId="756630158">
     <w:abstractNumId w:val="2"/>
   </w:num>
-  <w:num w:numId="22">
+  <w:num w:numId="22" w16cid:durableId="903099188">
     <w:abstractNumId w:val="28"/>
   </w:num>
-  <w:num w:numId="23">
+  <w:num w:numId="23" w16cid:durableId="769665868">
     <w:abstractNumId w:val="12"/>
   </w:num>
-  <w:num w:numId="24">
+  <w:num w:numId="24" w16cid:durableId="1180848270">
     <w:abstractNumId w:val="27"/>
   </w:num>
-  <w:num w:numId="25">
+  <w:num w:numId="25" w16cid:durableId="1540237607">
     <w:abstractNumId w:val="34"/>
   </w:num>
-  <w:num w:numId="26">
+  <w:num w:numId="26" w16cid:durableId="1393694523">
     <w:abstractNumId w:val="13"/>
   </w:num>
-  <w:num w:numId="27">
+  <w:num w:numId="27" w16cid:durableId="364409879">
     <w:abstractNumId w:val="17"/>
   </w:num>
-  <w:num w:numId="28">
+  <w:num w:numId="28" w16cid:durableId="972563018">
     <w:abstractNumId w:val="22"/>
   </w:num>
-  <w:num w:numId="29">
+  <w:num w:numId="29" w16cid:durableId="1168903642">
     <w:abstractNumId w:val="32"/>
   </w:num>
-  <w:num w:numId="30">
+  <w:num w:numId="30" w16cid:durableId="30808941">
     <w:abstractNumId w:val="1"/>
   </w:num>
-  <w:num w:numId="31">
+  <w:num w:numId="31" w16cid:durableId="1238320688">
     <w:abstractNumId w:val="19"/>
   </w:num>
-  <w:num w:numId="32">
+  <w:num w:numId="32" w16cid:durableId="1007370703">
     <w:abstractNumId w:val="21"/>
   </w:num>
-  <w:num w:numId="33">
+  <w:num w:numId="33" w16cid:durableId="1476604133">
     <w:abstractNumId w:val="8"/>
   </w:num>
-  <w:num w:numId="34">
+  <w:num w:numId="34" w16cid:durableId="871184626">
     <w:abstractNumId w:val="6"/>
   </w:num>
-  <w:num w:numId="35">
+  <w:num w:numId="35" w16cid:durableId="743992935">
     <w:abstractNumId w:val="24"/>
   </w:num>
   <w:numIdMacAtCleanup w:val="34"/>
@@ -23795,7 +24109,7 @@
 </file>
 
 <file path=word/styles.xml><?xml version="1.0" encoding="utf-8"?>
-<w:styles xmlns:mc="http://schemas.openxmlformats.org/markup-compatibility/2006" xmlns:r="http://schemas.openxmlformats.org/officeDocument/2006/relationships" xmlns:w="http://schemas.openxmlformats.org/wordprocessingml/2006/main" xmlns:w14="http://schemas.microsoft.com/office/word/2010/wordml" xmlns:w15="http://schemas.microsoft.com/office/word/2012/wordml" xmlns:w16cex="http://schemas.microsoft.com/office/word/2018/wordml/cex" xmlns:w16cid="http://schemas.microsoft.com/office/word/2016/wordml/cid" xmlns:w16="http://schemas.microsoft.com/office/word/2018/wordml" xmlns:w16sdtdh="http://schemas.microsoft.com/office/word/2020/wordml/sdtdatahash" xmlns:w16se="http://schemas.microsoft.com/office/word/2015/wordml/symex" mc:Ignorable="w14 w15 w16se w16cid w16 w16cex w16sdtdh">
+<w:styles xmlns:mc="http://schemas.openxmlformats.org/markup-compatibility/2006" xmlns:r="http://schemas.openxmlformats.org/officeDocument/2006/relationships" xmlns:w="http://schemas.openxmlformats.org/wordprocessingml/2006/main" xmlns:w14="http://schemas.microsoft.com/office/word/2010/wordml" xmlns:w15="http://schemas.microsoft.com/office/word/2012/wordml" xmlns:w16cex="http://schemas.microsoft.com/office/word/2018/wordml/cex" xmlns:w16cid="http://schemas.microsoft.com/office/word/2016/wordml/cid" xmlns:w16="http://schemas.microsoft.com/office/word/2018/wordml" xmlns:w16du="http://schemas.microsoft.com/office/word/2023/wordml/word16du" xmlns:w16sdtdh="http://schemas.microsoft.com/office/word/2020/wordml/sdtdatahash" xmlns:w16sdtfl="http://schemas.microsoft.com/office/word/2024/wordml/sdtformatlock" xmlns:w16se="http://schemas.microsoft.com/office/word/2015/wordml/symex" mc:Ignorable="w14 w15 w16se w16cid w16 w16cex w16sdtdh w16sdtfl w16du">
   <w:docDefaults>
     <w:rPrDefault>
       <w:rPr>
@@ -24395,7 +24709,6 @@
   <w:style w:type="character" w:default="1" w:styleId="Fuentedeprrafopredeter">
     <w:name w:val="Default Paragraph Font"/>
     <w:uiPriority w:val="1"/>
-    <w:semiHidden/>
     <w:unhideWhenUsed/>
   </w:style>
   <w:style w:type="table" w:default="1" w:styleId="Tablanormal">
@@ -24711,7 +25024,6 @@
     <w:name w:val="Normal (Web)"/>
     <w:basedOn w:val="Normal"/>
     <w:uiPriority w:val="99"/>
-    <w:semiHidden/>
     <w:unhideWhenUsed/>
     <w:rsid w:val="00E86D51"/>
     <w:pPr>

</xml_diff>

<commit_message>
codigo Front - Back y activad 4 Diseño del prototipo
</commit_message>
<xml_diff>
--- a/Actividad 1 - Identificar el proyecto tecnológico a trabajar.docx
+++ b/Actividad 1 - Identificar el proyecto tecnológico a trabajar.docx
@@ -1,42 +1,63 @@
 
 <file path=word/document.xml><?xml version="1.0" encoding="utf-8"?>
-<w:document xmlns:wpc="http://schemas.microsoft.com/office/word/2010/wordprocessingCanvas" xmlns:cx="http://schemas.microsoft.com/office/drawing/2014/chartex" xmlns:cx1="http://schemas.microsoft.com/office/drawing/2015/9/8/chartex" xmlns:cx2="http://schemas.microsoft.com/office/drawing/2015/10/21/chartex" xmlns:cx3="http://schemas.microsoft.com/office/drawing/2016/5/9/chartex" xmlns:cx4="http://schemas.microsoft.com/office/drawing/2016/5/10/chartex" xmlns:cx5="http://schemas.microsoft.com/office/drawing/2016/5/11/chartex" xmlns:cx6="http://schemas.microsoft.com/office/drawing/2016/5/12/chartex" xmlns:cx7="http://schemas.microsoft.com/office/drawing/2016/5/13/chartex" xmlns:cx8="http://schemas.microsoft.com/office/drawing/2016/5/14/chartex" xmlns:mc="http://schemas.openxmlformats.org/markup-compatibility/2006" xmlns:aink="http://schemas.microsoft.com/office/drawing/2016/ink" xmlns:am3d="http://schemas.microsoft.com/office/drawing/2017/model3d" xmlns:o="urn:schemas-microsoft-com:office:office" xmlns:oel="http://schemas.microsoft.com/office/2019/extlst" xmlns:r="http://schemas.openxmlformats.org/officeDocument/2006/relationships" xmlns:m="http://schemas.openxmlformats.org/officeDocument/2006/math" xmlns:v="urn:schemas-microsoft-com:vml" xmlns:wp14="http://schemas.microsoft.com/office/word/2010/wordprocessingDrawing" xmlns:wp="http://schemas.openxmlformats.org/drawingml/2006/wordprocessingDrawing" xmlns:w10="urn:schemas-microsoft-com:office:word" xmlns:w="http://schemas.openxmlformats.org/wordprocessingml/2006/main" xmlns:w14="http://schemas.microsoft.com/office/word/2010/wordml" xmlns:w15="http://schemas.microsoft.com/office/word/2012/wordml" xmlns:w16cex="http://schemas.microsoft.com/office/word/2018/wordml/cex" xmlns:w16cid="http://schemas.microsoft.com/office/word/2016/wordml/cid" xmlns:w16="http://schemas.microsoft.com/office/word/2018/wordml" xmlns:w16du="http://schemas.microsoft.com/office/word/2023/wordml/word16du" xmlns:w16sdtdh="http://schemas.microsoft.com/office/word/2020/wordml/sdtdatahash" xmlns:w16sdtfl="http://schemas.microsoft.com/office/word/2024/wordml/sdtformatlock" xmlns:w16se="http://schemas.microsoft.com/office/word/2015/wordml/symex" xmlns:wpg="http://schemas.microsoft.com/office/word/2010/wordprocessingGroup" xmlns:wpi="http://schemas.microsoft.com/office/word/2010/wordprocessingInk" xmlns:wne="http://schemas.microsoft.com/office/word/2006/wordml" xmlns:wps="http://schemas.microsoft.com/office/word/2010/wordprocessingShape" mc:Ignorable="w14 w15 w16se w16cid w16 w16cex w16sdtdh w16sdtfl w16du wp14">
+<w:document xmlns:wpc="http://schemas.microsoft.com/office/word/2010/wordprocessingCanvas" xmlns:cx="http://schemas.microsoft.com/office/drawing/2014/chartex" xmlns:cx1="http://schemas.microsoft.com/office/drawing/2015/9/8/chartex" xmlns:cx2="http://schemas.microsoft.com/office/drawing/2015/10/21/chartex" xmlns:cx3="http://schemas.microsoft.com/office/drawing/2016/5/9/chartex" xmlns:cx4="http://schemas.microsoft.com/office/drawing/2016/5/10/chartex" xmlns:cx5="http://schemas.microsoft.com/office/drawing/2016/5/11/chartex" xmlns:cx6="http://schemas.microsoft.com/office/drawing/2016/5/12/chartex" xmlns:cx7="http://schemas.microsoft.com/office/drawing/2016/5/13/chartex" xmlns:cx8="http://schemas.microsoft.com/office/drawing/2016/5/14/chartex" xmlns:mc="http://schemas.openxmlformats.org/markup-compatibility/2006" xmlns:aink="http://schemas.microsoft.com/office/drawing/2016/ink" xmlns:am3d="http://schemas.microsoft.com/office/drawing/2017/model3d" xmlns:o="urn:schemas-microsoft-com:office:office" xmlns:r="http://schemas.openxmlformats.org/officeDocument/2006/relationships" xmlns:m="http://schemas.openxmlformats.org/officeDocument/2006/math" xmlns:v="urn:schemas-microsoft-com:vml" xmlns:wp14="http://schemas.microsoft.com/office/word/2010/wordprocessingDrawing" xmlns:wp="http://schemas.openxmlformats.org/drawingml/2006/wordprocessingDrawing" xmlns:w10="urn:schemas-microsoft-com:office:word" xmlns:w="http://schemas.openxmlformats.org/wordprocessingml/2006/main" xmlns:w14="http://schemas.microsoft.com/office/word/2010/wordml" xmlns:w15="http://schemas.microsoft.com/office/word/2012/wordml" xmlns:w16cex="http://schemas.microsoft.com/office/word/2018/wordml/cex" xmlns:w16cid="http://schemas.microsoft.com/office/word/2016/wordml/cid" xmlns:w16="http://schemas.microsoft.com/office/word/2018/wordml" xmlns:w16sdtdh="http://schemas.microsoft.com/office/word/2020/wordml/sdtdatahash" xmlns:w16se="http://schemas.microsoft.com/office/word/2015/wordml/symex" xmlns:wpg="http://schemas.microsoft.com/office/word/2010/wordprocessingGroup" xmlns:wpi="http://schemas.microsoft.com/office/word/2010/wordprocessingInk" xmlns:wne="http://schemas.microsoft.com/office/word/2006/wordml" xmlns:wps="http://schemas.microsoft.com/office/word/2010/wordprocessingShape" mc:Ignorable="w14 w15 w16se w16cid w16 w16cex w16sdtdh wp14">
   <w:body>
     <w:p>
       <w:pPr>
         <w:pStyle w:val="Sinespaciado"/>
+        <w:jc w:val="center"/>
+        <w:rPr>
+          <w:lang w:eastAsia="es-CO"/>
+        </w:rPr>
+      </w:pPr>
+      <w:bookmarkStart w:id="0" w:name="_Hlk209864032"/>
+      <w:r>
+        <w:rPr>
+          <w:lang w:eastAsia="es-CO"/>
+        </w:rPr>
+        <w:t>Actividad 1 - Identificar el proyecto tecnol</w:t>
+      </w:r>
+      <w:r>
+        <w:rPr>
+          <w:rFonts w:hint="cs"/>
+          <w:lang w:eastAsia="es-CO"/>
+        </w:rPr>
+        <w:t>ó</w:t>
+      </w:r>
+      <w:r>
+        <w:rPr>
+          <w:lang w:eastAsia="es-CO"/>
+        </w:rPr>
+        <w:t>gico a trabajar</w:t>
+      </w:r>
+    </w:p>
+    <w:p>
+      <w:pPr>
+        <w:pStyle w:val="Sinespaciado"/>
+        <w:jc w:val="center"/>
+        <w:rPr>
+          <w:lang w:eastAsia="es-CO"/>
+        </w:rPr>
+      </w:pPr>
+    </w:p>
+    <w:p>
+      <w:pPr>
+        <w:pStyle w:val="Sinespaciado"/>
+        <w:jc w:val="center"/>
+        <w:rPr>
+          <w:rFonts w:ascii="Arial" w:hAnsi="Arial" w:cs="Arial"/>
+          <w:b/>
+          <w:bCs/>
+        </w:rPr>
+      </w:pPr>
+      <w:r>
         <w:rPr>
           <w:rStyle w:val="Textoennegrita"/>
           <w:rFonts w:ascii="Arial" w:hAnsi="Arial" w:cs="Arial"/>
           <w:b w:val="0"/>
           <w:bCs w:val="0"/>
         </w:rPr>
-      </w:pPr>
-      <w:bookmarkStart w:id="0" w:name="_Hlk209864032"/>
-      <w:r>
-        <w:rPr>
-          <w:lang w:eastAsia="es-CO"/>
-        </w:rPr>
-        <w:t>Actividad 1 - Identificar el proyecto tecnol</w:t>
-      </w:r>
-      <w:r>
-        <w:rPr>
-          <w:rFonts w:hint="cs"/>
-          <w:lang w:eastAsia="es-CO"/>
-        </w:rPr>
-        <w:t>ó</w:t>
-      </w:r>
-      <w:r>
-        <w:rPr>
-          <w:lang w:eastAsia="es-CO"/>
-        </w:rPr>
-        <w:t>gico a trabajar</w:t>
-      </w:r>
-      <w:r>
-        <w:rPr>
-          <w:lang w:eastAsia="es-CO"/>
-        </w:rPr>
-        <w:t xml:space="preserve"> </w:t>
+        <w:t>S</w:t>
       </w:r>
       <w:r>
         <w:rPr>
@@ -45,18 +66,8 @@
           <w:b w:val="0"/>
           <w:bCs w:val="0"/>
         </w:rPr>
-        <w:t xml:space="preserve">Sistema de Recolección </w:t>
-      </w:r>
-    </w:p>
-    <w:p>
-      <w:pPr>
-        <w:jc w:val="center"/>
-        <w:rPr>
-          <w:rFonts w:ascii="Arial" w:hAnsi="Arial" w:cs="Arial"/>
-          <w:b/>
-          <w:bCs/>
-        </w:rPr>
-      </w:pPr>
+        <w:t>istema de recolección</w:t>
+      </w:r>
       <w:r>
         <w:rPr>
           <w:rStyle w:val="Textoennegrita"/>
@@ -64,7 +75,16 @@
           <w:b w:val="0"/>
           <w:bCs w:val="0"/>
         </w:rPr>
-        <w:t>de Datos de Producción Textil en Tiempo Real</w:t>
+        <w:t xml:space="preserve"> </w:t>
+      </w:r>
+      <w:r>
+        <w:rPr>
+          <w:rStyle w:val="Textoennegrita"/>
+          <w:rFonts w:ascii="Arial" w:hAnsi="Arial" w:cs="Arial"/>
+          <w:b w:val="0"/>
+          <w:bCs w:val="0"/>
+        </w:rPr>
+        <w:t>de datos de producción textil en tiempo real</w:t>
       </w:r>
       <w:r>
         <w:rPr>
@@ -511,6 +531,7 @@
           <w:docPartUnique/>
         </w:docPartObj>
       </w:sdtPr>
+      <w:sdtEndPr/>
       <w:sdtContent>
         <w:p>
           <w:pPr>
@@ -3068,27 +3089,7 @@
                 <w:sz w:val="24"/>
                 <w:szCs w:val="24"/>
               </w:rPr>
-              <w:t>Metodología Kanba</w:t>
-            </w:r>
-            <w:r>
-              <w:rPr>
-                <w:rStyle w:val="Hipervnculo"/>
-                <w:rFonts w:ascii="Arial" w:hAnsi="Arial" w:cs="Arial"/>
-                <w:noProof/>
-                <w:sz w:val="24"/>
-                <w:szCs w:val="24"/>
-              </w:rPr>
-              <w:t>n</w:t>
-            </w:r>
-            <w:r>
-              <w:rPr>
-                <w:rStyle w:val="Hipervnculo"/>
-                <w:rFonts w:ascii="Arial" w:hAnsi="Arial" w:cs="Arial"/>
-                <w:noProof/>
-                <w:sz w:val="24"/>
-                <w:szCs w:val="24"/>
-              </w:rPr>
-              <w:t xml:space="preserve"> e Historias de Usuario</w:t>
+              <w:t>Metodología Kanban e Historias de Usuario</w:t>
             </w:r>
             <w:r>
               <w:rPr>
@@ -3565,27 +3566,7 @@
                 <w:sz w:val="24"/>
                 <w:szCs w:val="24"/>
               </w:rPr>
-              <w:t>Diagrama d</w:t>
-            </w:r>
-            <w:r>
-              <w:rPr>
-                <w:rStyle w:val="Hipervnculo"/>
-                <w:rFonts w:ascii="Arial" w:hAnsi="Arial" w:cs="Arial"/>
-                <w:noProof/>
-                <w:sz w:val="24"/>
-                <w:szCs w:val="24"/>
-              </w:rPr>
-              <w:t>e</w:t>
-            </w:r>
-            <w:r>
-              <w:rPr>
-                <w:rStyle w:val="Hipervnculo"/>
-                <w:rFonts w:ascii="Arial" w:hAnsi="Arial" w:cs="Arial"/>
-                <w:noProof/>
-                <w:sz w:val="24"/>
-                <w:szCs w:val="24"/>
-              </w:rPr>
-              <w:t xml:space="preserve"> Flujo</w:t>
+              <w:t>Diagrama de Flujo</w:t>
             </w:r>
             <w:r>
               <w:rPr>
@@ -3680,47 +3661,7 @@
                 <w:sz w:val="24"/>
                 <w:szCs w:val="24"/>
               </w:rPr>
-              <w:t>Cronograma de</w:t>
-            </w:r>
-            <w:r>
-              <w:rPr>
-                <w:rStyle w:val="Hipervnculo"/>
-                <w:rFonts w:ascii="Arial" w:hAnsi="Arial" w:cs="Arial"/>
-                <w:noProof/>
-                <w:sz w:val="24"/>
-                <w:szCs w:val="24"/>
-              </w:rPr>
-              <w:t xml:space="preserve"> </w:t>
-            </w:r>
-            <w:r>
-              <w:rPr>
-                <w:rStyle w:val="Hipervnculo"/>
-                <w:rFonts w:ascii="Arial" w:hAnsi="Arial" w:cs="Arial"/>
-                <w:noProof/>
-                <w:sz w:val="24"/>
-                <w:szCs w:val="24"/>
-              </w:rPr>
-              <w:t>co</w:t>
-            </w:r>
-            <w:r>
-              <w:rPr>
-                <w:rStyle w:val="Hipervnculo"/>
-                <w:rFonts w:ascii="Arial" w:hAnsi="Arial" w:cs="Arial"/>
-                <w:noProof/>
-                <w:sz w:val="24"/>
-                <w:szCs w:val="24"/>
-              </w:rPr>
-              <w:t>s</w:t>
-            </w:r>
-            <w:r>
-              <w:rPr>
-                <w:rStyle w:val="Hipervnculo"/>
-                <w:rFonts w:ascii="Arial" w:hAnsi="Arial" w:cs="Arial"/>
-                <w:noProof/>
-                <w:sz w:val="24"/>
-                <w:szCs w:val="24"/>
-              </w:rPr>
-              <w:t>tos</w:t>
+              <w:t>Cronograma de costos</w:t>
             </w:r>
             <w:r>
               <w:rPr>
@@ -9400,27 +9341,14 @@
       <w:r>
         <w:t xml:space="preserve">n </w:t>
       </w:r>
-      <w:r>
-        <w:fldChar w:fldCharType="begin"/>
-      </w:r>
-      <w:r>
-        <w:instrText xml:space="preserve"> SEQ Ilustración \* ARABIC </w:instrText>
-      </w:r>
-      <w:r>
-        <w:fldChar w:fldCharType="separate"/>
-      </w:r>
-      <w:r>
-        <w:rPr>
-          <w:noProof/>
-        </w:rPr>
-        <w:t>2</w:t>
-      </w:r>
-      <w:r>
-        <w:rPr>
-          <w:noProof/>
-        </w:rPr>
-        <w:fldChar w:fldCharType="end"/>
-      </w:r>
+      <w:fldSimple w:instr=" SEQ Ilustración \* ARABIC ">
+        <w:r>
+          <w:rPr>
+            <w:noProof/>
+          </w:rPr>
+          <w:t>2</w:t>
+        </w:r>
+      </w:fldSimple>
       <w:r>
         <w:t xml:space="preserve"> </w:t>
       </w:r>
@@ -9810,7 +9738,7 @@
           <w:szCs w:val="24"/>
           <w:lang w:val="en-US"/>
         </w:rPr>
-        <w:t xml:space="preserve">BRAINSTORMING]  [SCAMPER]   </w:t>
+        <w:t>BRAINSTORMING]  [</w:t>
       </w:r>
       <w:proofErr w:type="gramEnd"/>
       <w:r>
@@ -9821,7 +9749,7 @@
           <w:szCs w:val="24"/>
           <w:lang w:val="en-US"/>
         </w:rPr>
-        <w:t xml:space="preserve"> [HOW MIGHT WE]</w:t>
+        <w:t>SCAMPER]    [HOW MIGHT WE]</w:t>
       </w:r>
     </w:p>
     <w:p>
@@ -10528,27 +10456,14 @@
       <w:r>
         <w:t xml:space="preserve">n </w:t>
       </w:r>
-      <w:r>
-        <w:fldChar w:fldCharType="begin"/>
-      </w:r>
-      <w:r>
-        <w:instrText xml:space="preserve"> SEQ Ilustración \* ARABIC </w:instrText>
-      </w:r>
-      <w:r>
-        <w:fldChar w:fldCharType="separate"/>
-      </w:r>
-      <w:r>
-        <w:rPr>
-          <w:noProof/>
-        </w:rPr>
-        <w:t>3</w:t>
-      </w:r>
-      <w:r>
-        <w:rPr>
-          <w:noProof/>
-        </w:rPr>
-        <w:fldChar w:fldCharType="end"/>
-      </w:r>
+      <w:fldSimple w:instr=" SEQ Ilustración \* ARABIC ">
+        <w:r>
+          <w:rPr>
+            <w:noProof/>
+          </w:rPr>
+          <w:t>3</w:t>
+        </w:r>
+      </w:fldSimple>
       <w:r>
         <w:t xml:space="preserve"> </w:t>
       </w:r>
@@ -14826,21 +14741,7 @@
         <w:rPr>
           <w:rFonts w:ascii="Arial" w:hAnsi="Arial" w:cs="Arial"/>
         </w:rPr>
-        <w:t xml:space="preserve">Comparto </w:t>
-      </w:r>
-      <w:proofErr w:type="gramStart"/>
-      <w:r>
-        <w:rPr>
-          <w:rFonts w:ascii="Arial" w:hAnsi="Arial" w:cs="Arial"/>
-        </w:rPr>
-        <w:t>link</w:t>
-      </w:r>
-      <w:proofErr w:type="gramEnd"/>
-      <w:r>
-        <w:rPr>
-          <w:rFonts w:ascii="Arial" w:hAnsi="Arial" w:cs="Arial"/>
-        </w:rPr>
-        <w:t xml:space="preserve"> del tablero Kanban en Trello con el contenido completo de las Historias de usuario</w:t>
+        <w:t>Comparto link del tablero Kanban en Trello con el contenido completo de las Historias de usuario</w:t>
       </w:r>
     </w:p>
     <w:p>
@@ -14868,6 +14769,9 @@
         </w:rPr>
       </w:pPr>
       <w:r>
+        <w:rPr>
+          <w:noProof/>
+        </w:rPr>
         <w:drawing>
           <wp:inline distT="0" distB="0" distL="0" distR="0" wp14:anchorId="2429818D" wp14:editId="5DB2ABB9">
             <wp:extent cx="5612130" cy="2618740"/>
@@ -14886,7 +14790,7 @@
                     </pic:cNvPicPr>
                   </pic:nvPicPr>
                   <pic:blipFill>
-                    <a:blip r:embed="rId23">
+                    <a:blip r:embed="rId23" cstate="print">
                       <a:extLst>
                         <a:ext uri="{28A0092B-C50C-407E-A947-70E740481C1C}">
                           <a14:useLocalDpi xmlns:a14="http://schemas.microsoft.com/office/drawing/2010/main" val="0"/>
@@ -14920,6 +14824,9 @@
     </w:p>
     <w:p>
       <w:r>
+        <w:rPr>
+          <w:noProof/>
+        </w:rPr>
         <w:lastRenderedPageBreak/>
         <w:drawing>
           <wp:inline distT="0" distB="0" distL="0" distR="0" wp14:anchorId="45D1EE17" wp14:editId="1EC58046">
@@ -14939,7 +14846,7 @@
                     </pic:cNvPicPr>
                   </pic:nvPicPr>
                   <pic:blipFill>
-                    <a:blip r:embed="rId24">
+                    <a:blip r:embed="rId24" cstate="print">
                       <a:extLst>
                         <a:ext uri="{28A0092B-C50C-407E-A947-70E740481C1C}">
                           <a14:useLocalDpi xmlns:a14="http://schemas.microsoft.com/office/drawing/2010/main" val="0"/>
@@ -14978,6 +14885,9 @@
         </w:rPr>
       </w:pPr>
       <w:r>
+        <w:rPr>
+          <w:noProof/>
+        </w:rPr>
         <w:lastRenderedPageBreak/>
         <w:drawing>
           <wp:inline distT="0" distB="0" distL="0" distR="0" wp14:anchorId="799406FE" wp14:editId="3DED8C9D">
@@ -14997,7 +14907,7 @@
                     </pic:cNvPicPr>
                   </pic:nvPicPr>
                   <pic:blipFill>
-                    <a:blip r:embed="rId25">
+                    <a:blip r:embed="rId25" cstate="print">
                       <a:extLst>
                         <a:ext uri="{28A0092B-C50C-407E-A947-70E740481C1C}">
                           <a14:useLocalDpi xmlns:a14="http://schemas.microsoft.com/office/drawing/2010/main" val="0"/>
@@ -18064,7 +17974,7 @@
                 <v:stroke joinstyle="miter"/>
                 <v:path gradientshapeok="t" o:connecttype="rect"/>
               </v:shapetype>
-              <v:shape id="Cuadro de texto 1" o:spid="_x0000_s1026" type="#_x0000_t202" style="position:absolute;margin-left:50.95pt;margin-top:592.9pt;width:333.25pt;height:.05pt;z-index:251668480;visibility:visible;mso-wrap-style:square;mso-wrap-distance-left:9pt;mso-wrap-distance-top:0;mso-wrap-distance-right:9pt;mso-wrap-distance-bottom:0;mso-position-horizontal:absolute;mso-position-horizontal-relative:text;mso-position-vertical:absolute;mso-position-vertical-relative:text;v-text-anchor:top" o:gfxdata="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" stroked="f">
+              <v:shape id="Cuadro de texto 1" o:spid="_x0000_s1026" type="#_x0000_t202" style="position:absolute;margin-left:50.95pt;margin-top:592.9pt;width:333.25pt;height:.05pt;z-index:251668480;visibility:visible;mso-wrap-style:square;mso-wrap-distance-left:9pt;mso-wrap-distance-top:0;mso-wrap-distance-right:9pt;mso-wrap-distance-bottom:0;mso-position-horizontal:absolute;mso-position-horizontal-relative:text;mso-position-vertical:absolute;mso-position-vertical-relative:text;v-text-anchor:top" o:gfxdata="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" stroked="f">
                 <v:textbox style="mso-fit-shape-to-text:t" inset="0,0,0,0">
                   <w:txbxContent>
                     <w:p>
@@ -18260,6 +18170,9 @@
         </w:rPr>
       </w:pPr>
       <w:r>
+        <w:rPr>
+          <w:noProof/>
+        </w:rPr>
         <w:drawing>
           <wp:inline distT="0" distB="0" distL="0" distR="0" wp14:anchorId="282723D3" wp14:editId="35C642B7">
             <wp:extent cx="5612130" cy="2237105"/>
@@ -18278,7 +18191,7 @@
                     </pic:cNvPicPr>
                   </pic:nvPicPr>
                   <pic:blipFill>
-                    <a:blip r:embed="rId29">
+                    <a:blip r:embed="rId29" cstate="print">
                       <a:extLst>
                         <a:ext uri="{28A0092B-C50C-407E-A947-70E740481C1C}">
                           <a14:useLocalDpi xmlns:a14="http://schemas.microsoft.com/office/drawing/2010/main" val="0"/>
@@ -18332,6 +18245,9 @@
     </w:p>
     <w:p>
       <w:r>
+        <w:rPr>
+          <w:noProof/>
+        </w:rPr>
         <w:drawing>
           <wp:inline distT="0" distB="0" distL="0" distR="0" wp14:anchorId="25CC8156" wp14:editId="3805816F">
             <wp:extent cx="5612130" cy="648970"/>
@@ -18880,7 +18796,7 @@
               </wp:anchor>
             </w:drawing>
           </mc:Choice>
-          <mc:Fallback>
+          <mc:Fallback xmlns:w16sdtfl="http://schemas.microsoft.com/office/word/2024/wordml/sdtformatlock" xmlns:w16du="http://schemas.microsoft.com/office/word/2023/wordml/word16du" xmlns:oel="http://schemas.microsoft.com/office/2019/extlst">
             <w:pict>
               <v:rect w14:anchorId="2923D252" id="Rectángulo 8" o:spid="_x0000_s1026" style="position:absolute;margin-left:88.75pt;margin-top:143.2pt;width:34.9pt;height:7.15pt;rotation:-1981340fd;z-index:251678720;visibility:visible;mso-wrap-style:square;mso-width-percent:0;mso-height-percent:0;mso-wrap-distance-left:9pt;mso-wrap-distance-top:0;mso-wrap-distance-right:9pt;mso-wrap-distance-bottom:0;mso-position-horizontal:absolute;mso-position-horizontal-relative:text;mso-position-vertical:absolute;mso-position-vertical-relative:text;mso-width-percent:0;mso-height-percent:0;mso-width-relative:margin;mso-height-relative:margin;v-text-anchor:middle" o:gfxdata="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" fillcolor="black [3200]" strokecolor="black [480]" strokeweight="1.5pt"/>
             </w:pict>
@@ -19464,7 +19380,7 @@
 </file>
 
 <file path=word/endnotes.xml><?xml version="1.0" encoding="utf-8"?>
-<w:endnotes xmlns:wpc="http://schemas.microsoft.com/office/word/2010/wordprocessingCanvas" xmlns:cx="http://schemas.microsoft.com/office/drawing/2014/chartex" xmlns:cx1="http://schemas.microsoft.com/office/drawing/2015/9/8/chartex" xmlns:cx2="http://schemas.microsoft.com/office/drawing/2015/10/21/chartex" xmlns:cx3="http://schemas.microsoft.com/office/drawing/2016/5/9/chartex" xmlns:cx4="http://schemas.microsoft.com/office/drawing/2016/5/10/chartex" xmlns:cx5="http://schemas.microsoft.com/office/drawing/2016/5/11/chartex" xmlns:cx6="http://schemas.microsoft.com/office/drawing/2016/5/12/chartex" xmlns:cx7="http://schemas.microsoft.com/office/drawing/2016/5/13/chartex" xmlns:cx8="http://schemas.microsoft.com/office/drawing/2016/5/14/chartex" xmlns:mc="http://schemas.openxmlformats.org/markup-compatibility/2006" xmlns:aink="http://schemas.microsoft.com/office/drawing/2016/ink" xmlns:am3d="http://schemas.microsoft.com/office/drawing/2017/model3d" xmlns:o="urn:schemas-microsoft-com:office:office" xmlns:oel="http://schemas.microsoft.com/office/2019/extlst" xmlns:r="http://schemas.openxmlformats.org/officeDocument/2006/relationships" xmlns:m="http://schemas.openxmlformats.org/officeDocument/2006/math" xmlns:v="urn:schemas-microsoft-com:vml" xmlns:wp14="http://schemas.microsoft.com/office/word/2010/wordprocessingDrawing" xmlns:wp="http://schemas.openxmlformats.org/drawingml/2006/wordprocessingDrawing" xmlns:w10="urn:schemas-microsoft-com:office:word" xmlns:w="http://schemas.openxmlformats.org/wordprocessingml/2006/main" xmlns:w14="http://schemas.microsoft.com/office/word/2010/wordml" xmlns:w15="http://schemas.microsoft.com/office/word/2012/wordml" xmlns:w16cex="http://schemas.microsoft.com/office/word/2018/wordml/cex" xmlns:w16cid="http://schemas.microsoft.com/office/word/2016/wordml/cid" xmlns:w16="http://schemas.microsoft.com/office/word/2018/wordml" xmlns:w16du="http://schemas.microsoft.com/office/word/2023/wordml/word16du" xmlns:w16sdtdh="http://schemas.microsoft.com/office/word/2020/wordml/sdtdatahash" xmlns:w16sdtfl="http://schemas.microsoft.com/office/word/2024/wordml/sdtformatlock" xmlns:w16se="http://schemas.microsoft.com/office/word/2015/wordml/symex" xmlns:wpg="http://schemas.microsoft.com/office/word/2010/wordprocessingGroup" xmlns:wpi="http://schemas.microsoft.com/office/word/2010/wordprocessingInk" xmlns:wne="http://schemas.microsoft.com/office/word/2006/wordml" xmlns:wps="http://schemas.microsoft.com/office/word/2010/wordprocessingShape" mc:Ignorable="w14 w15 w16se w16cid w16 w16cex w16sdtdh w16sdtfl w16du wp14">
+<w:endnotes xmlns:wpc="http://schemas.microsoft.com/office/word/2010/wordprocessingCanvas" xmlns:cx="http://schemas.microsoft.com/office/drawing/2014/chartex" xmlns:cx1="http://schemas.microsoft.com/office/drawing/2015/9/8/chartex" xmlns:cx2="http://schemas.microsoft.com/office/drawing/2015/10/21/chartex" xmlns:cx3="http://schemas.microsoft.com/office/drawing/2016/5/9/chartex" xmlns:cx4="http://schemas.microsoft.com/office/drawing/2016/5/10/chartex" xmlns:cx5="http://schemas.microsoft.com/office/drawing/2016/5/11/chartex" xmlns:cx6="http://schemas.microsoft.com/office/drawing/2016/5/12/chartex" xmlns:cx7="http://schemas.microsoft.com/office/drawing/2016/5/13/chartex" xmlns:cx8="http://schemas.microsoft.com/office/drawing/2016/5/14/chartex" xmlns:mc="http://schemas.openxmlformats.org/markup-compatibility/2006" xmlns:aink="http://schemas.microsoft.com/office/drawing/2016/ink" xmlns:am3d="http://schemas.microsoft.com/office/drawing/2017/model3d" xmlns:o="urn:schemas-microsoft-com:office:office" xmlns:r="http://schemas.openxmlformats.org/officeDocument/2006/relationships" xmlns:m="http://schemas.openxmlformats.org/officeDocument/2006/math" xmlns:v="urn:schemas-microsoft-com:vml" xmlns:wp14="http://schemas.microsoft.com/office/word/2010/wordprocessingDrawing" xmlns:wp="http://schemas.openxmlformats.org/drawingml/2006/wordprocessingDrawing" xmlns:w10="urn:schemas-microsoft-com:office:word" xmlns:w="http://schemas.openxmlformats.org/wordprocessingml/2006/main" xmlns:w14="http://schemas.microsoft.com/office/word/2010/wordml" xmlns:w15="http://schemas.microsoft.com/office/word/2012/wordml" xmlns:w16cex="http://schemas.microsoft.com/office/word/2018/wordml/cex" xmlns:w16cid="http://schemas.microsoft.com/office/word/2016/wordml/cid" xmlns:w16="http://schemas.microsoft.com/office/word/2018/wordml" xmlns:w16sdtdh="http://schemas.microsoft.com/office/word/2020/wordml/sdtdatahash" xmlns:w16se="http://schemas.microsoft.com/office/word/2015/wordml/symex" xmlns:wpg="http://schemas.microsoft.com/office/word/2010/wordprocessingGroup" xmlns:wpi="http://schemas.microsoft.com/office/word/2010/wordprocessingInk" xmlns:wne="http://schemas.microsoft.com/office/word/2006/wordml" xmlns:wps="http://schemas.microsoft.com/office/word/2010/wordprocessingShape" mc:Ignorable="w14 w15 w16se w16cid w16 w16cex w16sdtdh wp14">
   <w:endnote w:type="separator" w:id="-1">
     <w:p>
       <w:pPr>
@@ -19489,7 +19405,7 @@
 </file>
 
 <file path=word/footnotes.xml><?xml version="1.0" encoding="utf-8"?>
-<w:footnotes xmlns:wpc="http://schemas.microsoft.com/office/word/2010/wordprocessingCanvas" xmlns:cx="http://schemas.microsoft.com/office/drawing/2014/chartex" xmlns:cx1="http://schemas.microsoft.com/office/drawing/2015/9/8/chartex" xmlns:cx2="http://schemas.microsoft.com/office/drawing/2015/10/21/chartex" xmlns:cx3="http://schemas.microsoft.com/office/drawing/2016/5/9/chartex" xmlns:cx4="http://schemas.microsoft.com/office/drawing/2016/5/10/chartex" xmlns:cx5="http://schemas.microsoft.com/office/drawing/2016/5/11/chartex" xmlns:cx6="http://schemas.microsoft.com/office/drawing/2016/5/12/chartex" xmlns:cx7="http://schemas.microsoft.com/office/drawing/2016/5/13/chartex" xmlns:cx8="http://schemas.microsoft.com/office/drawing/2016/5/14/chartex" xmlns:mc="http://schemas.openxmlformats.org/markup-compatibility/2006" xmlns:aink="http://schemas.microsoft.com/office/drawing/2016/ink" xmlns:am3d="http://schemas.microsoft.com/office/drawing/2017/model3d" xmlns:o="urn:schemas-microsoft-com:office:office" xmlns:oel="http://schemas.microsoft.com/office/2019/extlst" xmlns:r="http://schemas.openxmlformats.org/officeDocument/2006/relationships" xmlns:m="http://schemas.openxmlformats.org/officeDocument/2006/math" xmlns:v="urn:schemas-microsoft-com:vml" xmlns:wp14="http://schemas.microsoft.com/office/word/2010/wordprocessingDrawing" xmlns:wp="http://schemas.openxmlformats.org/drawingml/2006/wordprocessingDrawing" xmlns:w10="urn:schemas-microsoft-com:office:word" xmlns:w="http://schemas.openxmlformats.org/wordprocessingml/2006/main" xmlns:w14="http://schemas.microsoft.com/office/word/2010/wordml" xmlns:w15="http://schemas.microsoft.com/office/word/2012/wordml" xmlns:w16cex="http://schemas.microsoft.com/office/word/2018/wordml/cex" xmlns:w16cid="http://schemas.microsoft.com/office/word/2016/wordml/cid" xmlns:w16="http://schemas.microsoft.com/office/word/2018/wordml" xmlns:w16du="http://schemas.microsoft.com/office/word/2023/wordml/word16du" xmlns:w16sdtdh="http://schemas.microsoft.com/office/word/2020/wordml/sdtdatahash" xmlns:w16sdtfl="http://schemas.microsoft.com/office/word/2024/wordml/sdtformatlock" xmlns:w16se="http://schemas.microsoft.com/office/word/2015/wordml/symex" xmlns:wpg="http://schemas.microsoft.com/office/word/2010/wordprocessingGroup" xmlns:wpi="http://schemas.microsoft.com/office/word/2010/wordprocessingInk" xmlns:wne="http://schemas.microsoft.com/office/word/2006/wordml" xmlns:wps="http://schemas.microsoft.com/office/word/2010/wordprocessingShape" mc:Ignorable="w14 w15 w16se w16cid w16 w16cex w16sdtdh w16sdtfl w16du wp14">
+<w:footnotes xmlns:wpc="http://schemas.microsoft.com/office/word/2010/wordprocessingCanvas" xmlns:cx="http://schemas.microsoft.com/office/drawing/2014/chartex" xmlns:cx1="http://schemas.microsoft.com/office/drawing/2015/9/8/chartex" xmlns:cx2="http://schemas.microsoft.com/office/drawing/2015/10/21/chartex" xmlns:cx3="http://schemas.microsoft.com/office/drawing/2016/5/9/chartex" xmlns:cx4="http://schemas.microsoft.com/office/drawing/2016/5/10/chartex" xmlns:cx5="http://schemas.microsoft.com/office/drawing/2016/5/11/chartex" xmlns:cx6="http://schemas.microsoft.com/office/drawing/2016/5/12/chartex" xmlns:cx7="http://schemas.microsoft.com/office/drawing/2016/5/13/chartex" xmlns:cx8="http://schemas.microsoft.com/office/drawing/2016/5/14/chartex" xmlns:mc="http://schemas.openxmlformats.org/markup-compatibility/2006" xmlns:aink="http://schemas.microsoft.com/office/drawing/2016/ink" xmlns:am3d="http://schemas.microsoft.com/office/drawing/2017/model3d" xmlns:o="urn:schemas-microsoft-com:office:office" xmlns:r="http://schemas.openxmlformats.org/officeDocument/2006/relationships" xmlns:m="http://schemas.openxmlformats.org/officeDocument/2006/math" xmlns:v="urn:schemas-microsoft-com:vml" xmlns:wp14="http://schemas.microsoft.com/office/word/2010/wordprocessingDrawing" xmlns:wp="http://schemas.openxmlformats.org/drawingml/2006/wordprocessingDrawing" xmlns:w10="urn:schemas-microsoft-com:office:word" xmlns:w="http://schemas.openxmlformats.org/wordprocessingml/2006/main" xmlns:w14="http://schemas.microsoft.com/office/word/2010/wordml" xmlns:w15="http://schemas.microsoft.com/office/word/2012/wordml" xmlns:w16cex="http://schemas.microsoft.com/office/word/2018/wordml/cex" xmlns:w16cid="http://schemas.microsoft.com/office/word/2016/wordml/cid" xmlns:w16="http://schemas.microsoft.com/office/word/2018/wordml" xmlns:w16sdtdh="http://schemas.microsoft.com/office/word/2020/wordml/sdtdatahash" xmlns:w16se="http://schemas.microsoft.com/office/word/2015/wordml/symex" xmlns:wpg="http://schemas.microsoft.com/office/word/2010/wordprocessingGroup" xmlns:wpi="http://schemas.microsoft.com/office/word/2010/wordprocessingInk" xmlns:wne="http://schemas.microsoft.com/office/word/2006/wordml" xmlns:wps="http://schemas.microsoft.com/office/word/2010/wordprocessingShape" mc:Ignorable="w14 w15 w16se w16cid w16 w16cex w16sdtdh wp14">
   <w:footnote w:type="separator" w:id="-1">
     <w:p>
       <w:pPr>
@@ -19514,7 +19430,7 @@
 </file>
 
 <file path=word/header1.xml><?xml version="1.0" encoding="utf-8"?>
-<w:hdr xmlns:wpc="http://schemas.microsoft.com/office/word/2010/wordprocessingCanvas" xmlns:cx="http://schemas.microsoft.com/office/drawing/2014/chartex" xmlns:cx1="http://schemas.microsoft.com/office/drawing/2015/9/8/chartex" xmlns:cx2="http://schemas.microsoft.com/office/drawing/2015/10/21/chartex" xmlns:cx3="http://schemas.microsoft.com/office/drawing/2016/5/9/chartex" xmlns:cx4="http://schemas.microsoft.com/office/drawing/2016/5/10/chartex" xmlns:cx5="http://schemas.microsoft.com/office/drawing/2016/5/11/chartex" xmlns:cx6="http://schemas.microsoft.com/office/drawing/2016/5/12/chartex" xmlns:cx7="http://schemas.microsoft.com/office/drawing/2016/5/13/chartex" xmlns:cx8="http://schemas.microsoft.com/office/drawing/2016/5/14/chartex" xmlns:mc="http://schemas.openxmlformats.org/markup-compatibility/2006" xmlns:aink="http://schemas.microsoft.com/office/drawing/2016/ink" xmlns:am3d="http://schemas.microsoft.com/office/drawing/2017/model3d" xmlns:o="urn:schemas-microsoft-com:office:office" xmlns:oel="http://schemas.microsoft.com/office/2019/extlst" xmlns:r="http://schemas.openxmlformats.org/officeDocument/2006/relationships" xmlns:m="http://schemas.openxmlformats.org/officeDocument/2006/math" xmlns:v="urn:schemas-microsoft-com:vml" xmlns:wp14="http://schemas.microsoft.com/office/word/2010/wordprocessingDrawing" xmlns:wp="http://schemas.openxmlformats.org/drawingml/2006/wordprocessingDrawing" xmlns:w10="urn:schemas-microsoft-com:office:word" xmlns:w="http://schemas.openxmlformats.org/wordprocessingml/2006/main" xmlns:w14="http://schemas.microsoft.com/office/word/2010/wordml" xmlns:w15="http://schemas.microsoft.com/office/word/2012/wordml" xmlns:w16cex="http://schemas.microsoft.com/office/word/2018/wordml/cex" xmlns:w16cid="http://schemas.microsoft.com/office/word/2016/wordml/cid" xmlns:w16="http://schemas.microsoft.com/office/word/2018/wordml" xmlns:w16du="http://schemas.microsoft.com/office/word/2023/wordml/word16du" xmlns:w16sdtdh="http://schemas.microsoft.com/office/word/2020/wordml/sdtdatahash" xmlns:w16sdtfl="http://schemas.microsoft.com/office/word/2024/wordml/sdtformatlock" xmlns:w16se="http://schemas.microsoft.com/office/word/2015/wordml/symex" xmlns:wpg="http://schemas.microsoft.com/office/word/2010/wordprocessingGroup" xmlns:wpi="http://schemas.microsoft.com/office/word/2010/wordprocessingInk" xmlns:wne="http://schemas.microsoft.com/office/word/2006/wordml" xmlns:wps="http://schemas.microsoft.com/office/word/2010/wordprocessingShape" mc:Ignorable="w14 w15 w16se w16cid w16 w16cex w16sdtdh w16sdtfl w16du wp14">
+<w:hdr xmlns:wpc="http://schemas.microsoft.com/office/word/2010/wordprocessingCanvas" xmlns:cx="http://schemas.microsoft.com/office/drawing/2014/chartex" xmlns:cx1="http://schemas.microsoft.com/office/drawing/2015/9/8/chartex" xmlns:cx2="http://schemas.microsoft.com/office/drawing/2015/10/21/chartex" xmlns:cx3="http://schemas.microsoft.com/office/drawing/2016/5/9/chartex" xmlns:cx4="http://schemas.microsoft.com/office/drawing/2016/5/10/chartex" xmlns:cx5="http://schemas.microsoft.com/office/drawing/2016/5/11/chartex" xmlns:cx6="http://schemas.microsoft.com/office/drawing/2016/5/12/chartex" xmlns:cx7="http://schemas.microsoft.com/office/drawing/2016/5/13/chartex" xmlns:cx8="http://schemas.microsoft.com/office/drawing/2016/5/14/chartex" xmlns:mc="http://schemas.openxmlformats.org/markup-compatibility/2006" xmlns:aink="http://schemas.microsoft.com/office/drawing/2016/ink" xmlns:am3d="http://schemas.microsoft.com/office/drawing/2017/model3d" xmlns:o="urn:schemas-microsoft-com:office:office" xmlns:r="http://schemas.openxmlformats.org/officeDocument/2006/relationships" xmlns:m="http://schemas.openxmlformats.org/officeDocument/2006/math" xmlns:v="urn:schemas-microsoft-com:vml" xmlns:wp14="http://schemas.microsoft.com/office/word/2010/wordprocessingDrawing" xmlns:wp="http://schemas.openxmlformats.org/drawingml/2006/wordprocessingDrawing" xmlns:w10="urn:schemas-microsoft-com:office:word" xmlns:w="http://schemas.openxmlformats.org/wordprocessingml/2006/main" xmlns:w14="http://schemas.microsoft.com/office/word/2010/wordml" xmlns:w15="http://schemas.microsoft.com/office/word/2012/wordml" xmlns:w16cex="http://schemas.microsoft.com/office/word/2018/wordml/cex" xmlns:w16cid="http://schemas.microsoft.com/office/word/2016/wordml/cid" xmlns:w16="http://schemas.microsoft.com/office/word/2018/wordml" xmlns:w16sdtdh="http://schemas.microsoft.com/office/word/2020/wordml/sdtdatahash" xmlns:w16se="http://schemas.microsoft.com/office/word/2015/wordml/symex" xmlns:wpg="http://schemas.microsoft.com/office/word/2010/wordprocessingGroup" xmlns:wpi="http://schemas.microsoft.com/office/word/2010/wordprocessingInk" xmlns:wne="http://schemas.microsoft.com/office/word/2006/wordml" xmlns:wps="http://schemas.microsoft.com/office/word/2010/wordprocessingShape" mc:Ignorable="w14 w15 w16se w16cid w16 w16cex w16sdtdh wp14">
   <w:sdt>
     <w:sdtPr>
       <w:id w:val="1114945457"/>
@@ -19523,6 +19439,7 @@
         <w:docPartUnique/>
       </w:docPartObj>
     </w:sdtPr>
+    <w:sdtEndPr/>
     <w:sdtContent>
       <w:p>
         <w:pPr>
@@ -19563,7 +19480,7 @@
 </file>
 
 <file path=word/numbering.xml><?xml version="1.0" encoding="utf-8"?>
-<w:numbering xmlns:wpc="http://schemas.microsoft.com/office/word/2010/wordprocessingCanvas" xmlns:cx="http://schemas.microsoft.com/office/drawing/2014/chartex" xmlns:cx1="http://schemas.microsoft.com/office/drawing/2015/9/8/chartex" xmlns:cx2="http://schemas.microsoft.com/office/drawing/2015/10/21/chartex" xmlns:cx3="http://schemas.microsoft.com/office/drawing/2016/5/9/chartex" xmlns:cx4="http://schemas.microsoft.com/office/drawing/2016/5/10/chartex" xmlns:cx5="http://schemas.microsoft.com/office/drawing/2016/5/11/chartex" xmlns:cx6="http://schemas.microsoft.com/office/drawing/2016/5/12/chartex" xmlns:cx7="http://schemas.microsoft.com/office/drawing/2016/5/13/chartex" xmlns:cx8="http://schemas.microsoft.com/office/drawing/2016/5/14/chartex" xmlns:mc="http://schemas.openxmlformats.org/markup-compatibility/2006" xmlns:aink="http://schemas.microsoft.com/office/drawing/2016/ink" xmlns:am3d="http://schemas.microsoft.com/office/drawing/2017/model3d" xmlns:o="urn:schemas-microsoft-com:office:office" xmlns:oel="http://schemas.microsoft.com/office/2019/extlst" xmlns:r="http://schemas.openxmlformats.org/officeDocument/2006/relationships" xmlns:m="http://schemas.openxmlformats.org/officeDocument/2006/math" xmlns:v="urn:schemas-microsoft-com:vml" xmlns:wp14="http://schemas.microsoft.com/office/word/2010/wordprocessingDrawing" xmlns:wp="http://schemas.openxmlformats.org/drawingml/2006/wordprocessingDrawing" xmlns:w10="urn:schemas-microsoft-com:office:word" xmlns:w="http://schemas.openxmlformats.org/wordprocessingml/2006/main" xmlns:w14="http://schemas.microsoft.com/office/word/2010/wordml" xmlns:w15="http://schemas.microsoft.com/office/word/2012/wordml" xmlns:w16cex="http://schemas.microsoft.com/office/word/2018/wordml/cex" xmlns:w16cid="http://schemas.microsoft.com/office/word/2016/wordml/cid" xmlns:w16="http://schemas.microsoft.com/office/word/2018/wordml" xmlns:w16du="http://schemas.microsoft.com/office/word/2023/wordml/word16du" xmlns:w16sdtdh="http://schemas.microsoft.com/office/word/2020/wordml/sdtdatahash" xmlns:w16sdtfl="http://schemas.microsoft.com/office/word/2024/wordml/sdtformatlock" xmlns:w16se="http://schemas.microsoft.com/office/word/2015/wordml/symex" xmlns:wpg="http://schemas.microsoft.com/office/word/2010/wordprocessingGroup" xmlns:wpi="http://schemas.microsoft.com/office/word/2010/wordprocessingInk" xmlns:wne="http://schemas.microsoft.com/office/word/2006/wordml" xmlns:wps="http://schemas.microsoft.com/office/word/2010/wordprocessingShape" mc:Ignorable="w14 w15 w16se w16cid w16 w16cex w16sdtdh w16sdtfl w16du wp14">
+<w:numbering xmlns:wpc="http://schemas.microsoft.com/office/word/2010/wordprocessingCanvas" xmlns:cx="http://schemas.microsoft.com/office/drawing/2014/chartex" xmlns:cx1="http://schemas.microsoft.com/office/drawing/2015/9/8/chartex" xmlns:cx2="http://schemas.microsoft.com/office/drawing/2015/10/21/chartex" xmlns:cx3="http://schemas.microsoft.com/office/drawing/2016/5/9/chartex" xmlns:cx4="http://schemas.microsoft.com/office/drawing/2016/5/10/chartex" xmlns:cx5="http://schemas.microsoft.com/office/drawing/2016/5/11/chartex" xmlns:cx6="http://schemas.microsoft.com/office/drawing/2016/5/12/chartex" xmlns:cx7="http://schemas.microsoft.com/office/drawing/2016/5/13/chartex" xmlns:cx8="http://schemas.microsoft.com/office/drawing/2016/5/14/chartex" xmlns:mc="http://schemas.openxmlformats.org/markup-compatibility/2006" xmlns:aink="http://schemas.microsoft.com/office/drawing/2016/ink" xmlns:am3d="http://schemas.microsoft.com/office/drawing/2017/model3d" xmlns:o="urn:schemas-microsoft-com:office:office" xmlns:r="http://schemas.openxmlformats.org/officeDocument/2006/relationships" xmlns:m="http://schemas.openxmlformats.org/officeDocument/2006/math" xmlns:v="urn:schemas-microsoft-com:vml" xmlns:wp14="http://schemas.microsoft.com/office/word/2010/wordprocessingDrawing" xmlns:wp="http://schemas.openxmlformats.org/drawingml/2006/wordprocessingDrawing" xmlns:w10="urn:schemas-microsoft-com:office:word" xmlns:w="http://schemas.openxmlformats.org/wordprocessingml/2006/main" xmlns:w14="http://schemas.microsoft.com/office/word/2010/wordml" xmlns:w15="http://schemas.microsoft.com/office/word/2012/wordml" xmlns:w16cex="http://schemas.microsoft.com/office/word/2018/wordml/cex" xmlns:w16cid="http://schemas.microsoft.com/office/word/2016/wordml/cid" xmlns:w16="http://schemas.microsoft.com/office/word/2018/wordml" xmlns:w16sdtdh="http://schemas.microsoft.com/office/word/2020/wordml/sdtdatahash" xmlns:w16se="http://schemas.microsoft.com/office/word/2015/wordml/symex" xmlns:wpg="http://schemas.microsoft.com/office/word/2010/wordprocessingGroup" xmlns:wpi="http://schemas.microsoft.com/office/word/2010/wordprocessingInk" xmlns:wne="http://schemas.microsoft.com/office/word/2006/wordml" xmlns:wps="http://schemas.microsoft.com/office/word/2010/wordprocessingShape" mc:Ignorable="w14 w15 w16se w16cid w16 w16cex w16sdtdh wp14">
   <w:abstractNum w:abstractNumId="0" w15:restartNumberingAfterBreak="0">
     <w:nsid w:val="09344707"/>
     <w:multiLevelType w:val="multilevel"/>
@@ -23999,109 +23916,109 @@
       </w:rPr>
     </w:lvl>
   </w:abstractNum>
-  <w:num w:numId="1" w16cid:durableId="1315716901">
+  <w:num w:numId="1">
     <w:abstractNumId w:val="18"/>
   </w:num>
-  <w:num w:numId="2" w16cid:durableId="1831485209">
+  <w:num w:numId="2">
     <w:abstractNumId w:val="30"/>
   </w:num>
-  <w:num w:numId="3" w16cid:durableId="23751387">
+  <w:num w:numId="3">
     <w:abstractNumId w:val="23"/>
   </w:num>
-  <w:num w:numId="4" w16cid:durableId="461314763">
+  <w:num w:numId="4">
     <w:abstractNumId w:val="29"/>
   </w:num>
-  <w:num w:numId="5" w16cid:durableId="1791246255">
+  <w:num w:numId="5">
     <w:abstractNumId w:val="7"/>
   </w:num>
-  <w:num w:numId="6" w16cid:durableId="1697341399">
+  <w:num w:numId="6">
     <w:abstractNumId w:val="26"/>
   </w:num>
-  <w:num w:numId="7" w16cid:durableId="2089691220">
+  <w:num w:numId="7">
     <w:abstractNumId w:val="16"/>
   </w:num>
-  <w:num w:numId="8" w16cid:durableId="1069964751">
+  <w:num w:numId="8">
     <w:abstractNumId w:val="31"/>
   </w:num>
-  <w:num w:numId="9" w16cid:durableId="1697924302">
+  <w:num w:numId="9">
     <w:abstractNumId w:val="11"/>
   </w:num>
-  <w:num w:numId="10" w16cid:durableId="438260111">
+  <w:num w:numId="10">
     <w:abstractNumId w:val="0"/>
   </w:num>
-  <w:num w:numId="11" w16cid:durableId="1217203068">
+  <w:num w:numId="11">
     <w:abstractNumId w:val="9"/>
   </w:num>
-  <w:num w:numId="12" w16cid:durableId="767846734">
+  <w:num w:numId="12">
     <w:abstractNumId w:val="3"/>
   </w:num>
-  <w:num w:numId="13" w16cid:durableId="1627083539">
+  <w:num w:numId="13">
     <w:abstractNumId w:val="33"/>
   </w:num>
-  <w:num w:numId="14" w16cid:durableId="1112896053">
+  <w:num w:numId="14">
     <w:abstractNumId w:val="10"/>
   </w:num>
-  <w:num w:numId="15" w16cid:durableId="523597391">
+  <w:num w:numId="15">
     <w:abstractNumId w:val="4"/>
   </w:num>
-  <w:num w:numId="16" w16cid:durableId="1026836368">
+  <w:num w:numId="16">
     <w:abstractNumId w:val="15"/>
   </w:num>
-  <w:num w:numId="17" w16cid:durableId="31271076">
+  <w:num w:numId="17">
     <w:abstractNumId w:val="20"/>
   </w:num>
-  <w:num w:numId="18" w16cid:durableId="344668603">
+  <w:num w:numId="18">
     <w:abstractNumId w:val="25"/>
   </w:num>
-  <w:num w:numId="19" w16cid:durableId="75132838">
+  <w:num w:numId="19">
     <w:abstractNumId w:val="14"/>
   </w:num>
-  <w:num w:numId="20" w16cid:durableId="816409940">
+  <w:num w:numId="20">
     <w:abstractNumId w:val="5"/>
   </w:num>
-  <w:num w:numId="21" w16cid:durableId="756630158">
+  <w:num w:numId="21">
     <w:abstractNumId w:val="2"/>
   </w:num>
-  <w:num w:numId="22" w16cid:durableId="903099188">
+  <w:num w:numId="22">
     <w:abstractNumId w:val="28"/>
   </w:num>
-  <w:num w:numId="23" w16cid:durableId="769665868">
+  <w:num w:numId="23">
     <w:abstractNumId w:val="12"/>
   </w:num>
-  <w:num w:numId="24" w16cid:durableId="1180848270">
+  <w:num w:numId="24">
     <w:abstractNumId w:val="27"/>
   </w:num>
-  <w:num w:numId="25" w16cid:durableId="1540237607">
+  <w:num w:numId="25">
     <w:abstractNumId w:val="34"/>
   </w:num>
-  <w:num w:numId="26" w16cid:durableId="1393694523">
+  <w:num w:numId="26">
     <w:abstractNumId w:val="13"/>
   </w:num>
-  <w:num w:numId="27" w16cid:durableId="364409879">
+  <w:num w:numId="27">
     <w:abstractNumId w:val="17"/>
   </w:num>
-  <w:num w:numId="28" w16cid:durableId="972563018">
+  <w:num w:numId="28">
     <w:abstractNumId w:val="22"/>
   </w:num>
-  <w:num w:numId="29" w16cid:durableId="1168903642">
+  <w:num w:numId="29">
     <w:abstractNumId w:val="32"/>
   </w:num>
-  <w:num w:numId="30" w16cid:durableId="30808941">
+  <w:num w:numId="30">
     <w:abstractNumId w:val="1"/>
   </w:num>
-  <w:num w:numId="31" w16cid:durableId="1238320688">
+  <w:num w:numId="31">
     <w:abstractNumId w:val="19"/>
   </w:num>
-  <w:num w:numId="32" w16cid:durableId="1007370703">
+  <w:num w:numId="32">
     <w:abstractNumId w:val="21"/>
   </w:num>
-  <w:num w:numId="33" w16cid:durableId="1476604133">
+  <w:num w:numId="33">
     <w:abstractNumId w:val="8"/>
   </w:num>
-  <w:num w:numId="34" w16cid:durableId="871184626">
+  <w:num w:numId="34">
     <w:abstractNumId w:val="6"/>
   </w:num>
-  <w:num w:numId="35" w16cid:durableId="743992935">
+  <w:num w:numId="35">
     <w:abstractNumId w:val="24"/>
   </w:num>
   <w:numIdMacAtCleanup w:val="34"/>
@@ -24109,7 +24026,7 @@
 </file>
 
 <file path=word/styles.xml><?xml version="1.0" encoding="utf-8"?>
-<w:styles xmlns:mc="http://schemas.openxmlformats.org/markup-compatibility/2006" xmlns:r="http://schemas.openxmlformats.org/officeDocument/2006/relationships" xmlns:w="http://schemas.openxmlformats.org/wordprocessingml/2006/main" xmlns:w14="http://schemas.microsoft.com/office/word/2010/wordml" xmlns:w15="http://schemas.microsoft.com/office/word/2012/wordml" xmlns:w16cex="http://schemas.microsoft.com/office/word/2018/wordml/cex" xmlns:w16cid="http://schemas.microsoft.com/office/word/2016/wordml/cid" xmlns:w16="http://schemas.microsoft.com/office/word/2018/wordml" xmlns:w16du="http://schemas.microsoft.com/office/word/2023/wordml/word16du" xmlns:w16sdtdh="http://schemas.microsoft.com/office/word/2020/wordml/sdtdatahash" xmlns:w16sdtfl="http://schemas.microsoft.com/office/word/2024/wordml/sdtformatlock" xmlns:w16se="http://schemas.microsoft.com/office/word/2015/wordml/symex" mc:Ignorable="w14 w15 w16se w16cid w16 w16cex w16sdtdh w16sdtfl w16du">
+<w:styles xmlns:mc="http://schemas.openxmlformats.org/markup-compatibility/2006" xmlns:r="http://schemas.openxmlformats.org/officeDocument/2006/relationships" xmlns:w="http://schemas.openxmlformats.org/wordprocessingml/2006/main" xmlns:w14="http://schemas.microsoft.com/office/word/2010/wordml" xmlns:w15="http://schemas.microsoft.com/office/word/2012/wordml" xmlns:w16cex="http://schemas.microsoft.com/office/word/2018/wordml/cex" xmlns:w16cid="http://schemas.microsoft.com/office/word/2016/wordml/cid" xmlns:w16="http://schemas.microsoft.com/office/word/2018/wordml" xmlns:w16sdtdh="http://schemas.microsoft.com/office/word/2020/wordml/sdtdatahash" xmlns:w16se="http://schemas.microsoft.com/office/word/2015/wordml/symex" mc:Ignorable="w14 w15 w16se w16cid w16 w16cex w16sdtdh">
   <w:docDefaults>
     <w:rPrDefault>
       <w:rPr>
@@ -24709,6 +24626,7 @@
   <w:style w:type="character" w:default="1" w:styleId="Fuentedeprrafopredeter">
     <w:name w:val="Default Paragraph Font"/>
     <w:uiPriority w:val="1"/>
+    <w:semiHidden/>
     <w:unhideWhenUsed/>
   </w:style>
   <w:style w:type="table" w:default="1" w:styleId="Tablanormal">

</xml_diff>